<commit_message>
docs: finalize OneFlow hackathon documentation
</commit_message>
<xml_diff>
--- a/docs/OneFlow_Project_Documentation.docx
+++ b/docs/OneFlow_Project_Documentation.docx
@@ -108,13 +108,13 @@
         <w:tblLook w:firstColumn="1" w:firstRow="1" w:lastColumn="0" w:lastRow="0" w:noHBand="0" w:noVBand="1" w:val="04A0"/>
       </w:tblPr>
       <w:tblGrid>
-        <w:gridCol w:w="4968"/>
-        <w:gridCol w:w="4968"/>
+        <w:gridCol w:w="4997"/>
+        <w:gridCol w:w="4997"/>
       </w:tblGrid>
       <w:tr>
         <w:tc>
           <w:tcPr>
-            <w:tcW w:type="dxa" w:w="4968"/>
+            <w:tcW w:type="dxa" w:w="4997"/>
             <w:shd w:fill="0B3A70"/>
           </w:tcPr>
           <w:p>
@@ -129,7 +129,7 @@
         </w:tc>
         <w:tc>
           <w:tcPr>
-            <w:tcW w:type="dxa" w:w="4968"/>
+            <w:tcW w:type="dxa" w:w="4997"/>
             <w:shd w:fill="0B3A70"/>
           </w:tcPr>
           <w:p>
@@ -142,25 +142,28 @@
             </w:r>
           </w:p>
         </w:tc>
+        <w:trPr>
+          <w:tblHeader/>
+        </w:trPr>
       </w:tr>
       <w:tr>
         <w:tc>
           <w:tcPr>
-            <w:tcW w:type="dxa" w:w="4968"/>
+            <w:tcW w:type="dxa" w:w="4997"/>
           </w:tcPr>
           <w:p>
             <w:r>
-              <w:t>Owner</w:t>
+              <w:t>Owner Team</w:t>
             </w:r>
           </w:p>
         </w:tc>
         <w:tc>
           <w:tcPr>
-            <w:tcW w:type="dxa" w:w="4968"/>
+            <w:tcW w:type="dxa" w:w="4997"/>
           </w:tcPr>
           <w:p>
             <w:r>
-              <w:t>Team Error 404</w:t>
+              <w:t>Error 404</w:t>
             </w:r>
           </w:p>
         </w:tc>
@@ -168,7 +171,29 @@
       <w:tr>
         <w:tc>
           <w:tcPr>
-            <w:tcW w:type="dxa" w:w="4968"/>
+            <w:tcW w:type="dxa" w:w="4997"/>
+          </w:tcPr>
+          <w:p>
+            <w:r>
+              <w:t>Project team</w:t>
+            </w:r>
+          </w:p>
+        </w:tc>
+        <w:tc>
+          <w:tcPr>
+            <w:tcW w:type="dxa" w:w="4997"/>
+          </w:tcPr>
+          <w:p>
+            <w:r>
+              <w:t>Thamotharan, Renuka Malar; Ramachandran, Yuganeswary; Hairul Afizee; Bashari, Noorliana</w:t>
+            </w:r>
+          </w:p>
+        </w:tc>
+      </w:tr>
+      <w:tr>
+        <w:tc>
+          <w:tcPr>
+            <w:tcW w:type="dxa" w:w="4997"/>
           </w:tcPr>
           <w:p>
             <w:r>
@@ -178,7 +203,7 @@
         </w:tc>
         <w:tc>
           <w:tcPr>
-            <w:tcW w:type="dxa" w:w="4968"/>
+            <w:tcW w:type="dxa" w:w="4997"/>
           </w:tcPr>
           <w:p>
             <w:r>
@@ -190,29 +215,7 @@
       <w:tr>
         <w:tc>
           <w:tcPr>
-            <w:tcW w:type="dxa" w:w="4968"/>
-          </w:tcPr>
-          <w:p>
-            <w:r>
-              <w:t>Scope</w:t>
-            </w:r>
-          </w:p>
-        </w:tc>
-        <w:tc>
-          <w:tcPr>
-            <w:tcW w:type="dxa" w:w="4968"/>
-          </w:tcPr>
-          <w:p>
-            <w:r>
-              <w:t>Implemented prototype, demo data, deployment and proposed direction</w:t>
-            </w:r>
-          </w:p>
-        </w:tc>
-      </w:tr>
-      <w:tr>
-        <w:tc>
-          <w:tcPr>
-            <w:tcW w:type="dxa" w:w="4968"/>
+            <w:tcW w:type="dxa" w:w="4997"/>
           </w:tcPr>
           <w:p>
             <w:r>
@@ -222,11 +225,11 @@
         </w:tc>
         <w:tc>
           <w:tcPr>
-            <w:tcW w:type="dxa" w:w="4968"/>
+            <w:tcW w:type="dxa" w:w="4997"/>
           </w:tcPr>
           <w:p>
             <w:r>
-              <w:t>Internal; no secrets or infrastructure addresses included</w:t>
+              <w:t>Internal; no secrets, tokens, IP addresses, or hostnames included</w:t>
             </w:r>
           </w:p>
         </w:tc>
@@ -246,7 +249,7 @@
         <w:spacing w:after="120"/>
       </w:pPr>
       <w:r>
-        <w:t>In Word, select References → Update Table after opening this document.</w:t>
+        <w:t>In Microsoft Word, select References → Update Table after opening this document.</w:t>
       </w:r>
     </w:p>
     <w:p>
@@ -262,7 +265,7 @@
         <w:pStyle w:val="Heading1"/>
       </w:pPr>
       <w:r>
-        <w:t>1. Executive summary</w:t>
+        <w:t>Project Team</w:t>
       </w:r>
     </w:p>
     <w:p>
@@ -270,31 +273,7 @@
         <w:spacing w:after="120"/>
       </w:pPr>
       <w:r>
-        <w:t>OneFlow is a Phase 1 employee-lifecycle orchestration prototype for PPG AEN Hackathon 2026. A mock Workday event becomes a visible OneFlow case with role-based tasks, forms, notifications, activity history, and reporting. It demonstrates value; it is not a live enterprise integration or production system.</w:t>
-      </w:r>
-    </w:p>
-    <w:p>
-      <w:pPr>
-        <w:pStyle w:val="Heading1"/>
-      </w:pPr>
-      <w:r>
-        <w:t>2. Hackathon challenge</w:t>
-      </w:r>
-    </w:p>
-    <w:p>
-      <w:pPr>
-        <w:spacing w:after="120"/>
-      </w:pPr>
-      <w:r>
-        <w:t>The exact original hackathon-question wording is unavailable in this repository. This package therefore documents the demonstrated business problem: fragmented hand-offs when employees join or leave, unclear ownership, delayed readiness, and limited audit visibility.</w:t>
-      </w:r>
-    </w:p>
-    <w:p>
-      <w:pPr>
-        <w:pStyle w:val="Heading1"/>
-      </w:pPr>
-      <w:r>
-        <w:t>3. Requirement assessment</w:t>
+        <w:t>Team Error 404</w:t>
       </w:r>
     </w:p>
     <w:tbl>
@@ -305,14 +284,13 @@
         <w:tblLook w:firstColumn="1" w:firstRow="1" w:lastColumn="0" w:lastRow="0" w:noHBand="0" w:noVBand="1" w:val="04A0"/>
       </w:tblPr>
       <w:tblGrid>
-        <w:gridCol w:w="3312"/>
-        <w:gridCol w:w="3312"/>
-        <w:gridCol w:w="3312"/>
+        <w:gridCol w:w="4997"/>
+        <w:gridCol w:w="4997"/>
       </w:tblGrid>
       <w:tr>
         <w:tc>
           <w:tcPr>
-            <w:tcW w:type="dxa" w:w="3312"/>
+            <w:tcW w:type="dxa" w:w="4997"/>
             <w:shd w:fill="0B3A70"/>
           </w:tcPr>
           <w:p>
@@ -321,13 +299,13 @@
                 <w:b/>
                 <w:color w:val="FFFFFF"/>
               </w:rPr>
-              <w:t>Need</w:t>
+              <w:t>Team Member</w:t>
             </w:r>
           </w:p>
         </w:tc>
         <w:tc>
           <w:tcPr>
-            <w:tcW w:type="dxa" w:w="3312"/>
+            <w:tcW w:type="dxa" w:w="4997"/>
             <w:shd w:fill="0B3A70"/>
           </w:tcPr>
           <w:p>
@@ -336,22 +314,32 @@
                 <w:b/>
                 <w:color w:val="FFFFFF"/>
               </w:rPr>
-              <w:t>Assessment</w:t>
+              <w:t>Project</w:t>
+            </w:r>
+          </w:p>
+        </w:tc>
+        <w:trPr>
+          <w:tblHeader/>
+        </w:trPr>
+      </w:tr>
+      <w:tr>
+        <w:tc>
+          <w:tcPr>
+            <w:tcW w:type="dxa" w:w="4997"/>
+          </w:tcPr>
+          <w:p>
+            <w:r>
+              <w:t>Thamotharan, Renuka Malar</w:t>
             </w:r>
           </w:p>
         </w:tc>
         <w:tc>
           <w:tcPr>
-            <w:tcW w:type="dxa" w:w="3312"/>
-            <w:shd w:fill="0B3A70"/>
+            <w:tcW w:type="dxa" w:w="4997"/>
           </w:tcPr>
           <w:p>
             <w:r>
-              <w:rPr>
-                <w:b/>
-                <w:color w:val="FFFFFF"/>
-              </w:rPr>
-              <w:t>Evidence</w:t>
+              <w:t>OneFlow — PPG AEN Hackathon 2026</w:t>
             </w:r>
           </w:p>
         </w:tc>
@@ -359,31 +347,21 @@
       <w:tr>
         <w:tc>
           <w:tcPr>
-            <w:tcW w:type="dxa" w:w="3312"/>
+            <w:tcW w:type="dxa" w:w="4997"/>
           </w:tcPr>
           <w:p>
             <w:r>
-              <w:t>Lifecycle orchestration</w:t>
+              <w:t>Ramachandran, Yuganeswary</w:t>
             </w:r>
           </w:p>
         </w:tc>
         <w:tc>
           <w:tcPr>
-            <w:tcW w:type="dxa" w:w="3312"/>
+            <w:tcW w:type="dxa" w:w="4997"/>
           </w:tcPr>
           <w:p>
             <w:r>
-              <w:t>Demonstrated</w:t>
-            </w:r>
-          </w:p>
-        </w:tc>
-        <w:tc>
-          <w:tcPr>
-            <w:tcW w:type="dxa" w:w="3312"/>
-          </w:tcPr>
-          <w:p>
-            <w:r>
-              <w:t>Cases, task templates, history and status</w:t>
+              <w:t>OneFlow — PPG AEN Hackathon 2026</w:t>
             </w:r>
           </w:p>
         </w:tc>
@@ -391,31 +369,21 @@
       <w:tr>
         <w:tc>
           <w:tcPr>
-            <w:tcW w:type="dxa" w:w="3312"/>
+            <w:tcW w:type="dxa" w:w="4997"/>
           </w:tcPr>
           <w:p>
             <w:r>
-              <w:t>Cross-team notifications</w:t>
+              <w:t>Hairul Afizee</w:t>
             </w:r>
           </w:p>
         </w:tc>
         <w:tc>
           <w:tcPr>
-            <w:tcW w:type="dxa" w:w="3312"/>
+            <w:tcW w:type="dxa" w:w="4997"/>
           </w:tcPr>
           <w:p>
             <w:r>
-              <w:t>Simulated</w:t>
-            </w:r>
-          </w:p>
-        </w:tc>
-        <w:tc>
-          <w:tcPr>
-            <w:tcW w:type="dxa" w:w="3312"/>
-          </w:tcPr>
-          <w:p>
-            <w:r>
-              <w:t>Mock inbox; optional SES configuration</w:t>
+              <w:t>OneFlow — PPG AEN Hackathon 2026</w:t>
             </w:r>
           </w:p>
         </w:tc>
@@ -423,31 +391,223 @@
       <w:tr>
         <w:tc>
           <w:tcPr>
-            <w:tcW w:type="dxa" w:w="3312"/>
+            <w:tcW w:type="dxa" w:w="4997"/>
           </w:tcPr>
           <w:p>
             <w:r>
-              <w:t>Workday source</w:t>
+              <w:t>Bashari, Noorliana</w:t>
             </w:r>
           </w:p>
         </w:tc>
         <w:tc>
           <w:tcPr>
-            <w:tcW w:type="dxa" w:w="3312"/>
+            <w:tcW w:type="dxa" w:w="4997"/>
           </w:tcPr>
           <w:p>
             <w:r>
-              <w:t>Simulated</w:t>
+              <w:t>OneFlow — PPG AEN Hackathon 2026</w:t>
+            </w:r>
+          </w:p>
+        </w:tc>
+      </w:tr>
+    </w:tbl>
+    <w:p/>
+    <w:p>
+      <w:pPr>
+        <w:pStyle w:val="Heading1"/>
+      </w:pPr>
+      <w:r>
+        <w:t>1. Executive summary</w:t>
+      </w:r>
+    </w:p>
+    <w:p>
+      <w:pPr>
+        <w:spacing w:after="120"/>
+      </w:pPr>
+      <w:r>
+        <w:t>OneFlow is a Phase 1 employee-lifecycle orchestration prototype for PPG AEN Hackathon 2026. It demonstrates how a mock Workday change can become a visible OneFlow lifecycle case with role-based work, forms, notifications, activity history, and reporting. Users access the hackathon demo at https://oneflow.highrulez.com. The prototype is not a live enterprise integration or a production system.</w:t>
+      </w:r>
+    </w:p>
+    <w:p>
+      <w:pPr>
+        <w:pStyle w:val="Heading1"/>
+      </w:pPr>
+      <w:r>
+        <w:t>2. Hackathon challenge</w:t>
+      </w:r>
+    </w:p>
+    <w:p>
+      <w:pPr>
+        <w:spacing w:after="120"/>
+      </w:pPr>
+      <w:r>
+        <w:t>The exact original hackathon-question wording is unavailable in the repository. This package therefore documents the demonstrated business problem: fragmented hand-offs when employees join or leave, unclear ownership, delayed readiness, and limited audit visibility.</w:t>
+      </w:r>
+    </w:p>
+    <w:p>
+      <w:pPr>
+        <w:pStyle w:val="Heading1"/>
+      </w:pPr>
+      <w:r>
+        <w:t>3. How OneFlow addresses the hackathon problem</w:t>
+      </w:r>
+    </w:p>
+    <w:tbl>
+      <w:tblPr>
+        <w:tblStyle w:val="TableGrid"/>
+        <w:tblW w:type="auto" w:w="0"/>
+        <w:jc w:val="center"/>
+        <w:tblLook w:firstColumn="1" w:firstRow="1" w:lastColumn="0" w:lastRow="0" w:noHBand="0" w:noVBand="1" w:val="04A0"/>
+      </w:tblPr>
+      <w:tblGrid>
+        <w:gridCol w:w="2498"/>
+        <w:gridCol w:w="2498"/>
+        <w:gridCol w:w="2498"/>
+        <w:gridCol w:w="2498"/>
+      </w:tblGrid>
+      <w:tr>
+        <w:tc>
+          <w:tcPr>
+            <w:tcW w:type="dxa" w:w="2498"/>
+            <w:shd w:fill="0B3A70"/>
+          </w:tcPr>
+          <w:p>
+            <w:pPr>
+              <w:spacing w:after="0"/>
+            </w:pPr>
+            <w:r>
+              <w:rPr>
+                <w:b/>
+                <w:color w:val="FFFFFF"/>
+                <w:sz w:val="16"/>
+              </w:rPr>
+              <w:t>Problem</w:t>
             </w:r>
           </w:p>
         </w:tc>
         <w:tc>
           <w:tcPr>
-            <w:tcW w:type="dxa" w:w="3312"/>
+            <w:tcW w:type="dxa" w:w="2498"/>
+            <w:shd w:fill="0B3A70"/>
           </w:tcPr>
           <w:p>
+            <w:pPr>
+              <w:spacing w:after="0"/>
+            </w:pPr>
             <w:r>
-              <w:t>PPG Workday mock only</w:t>
+              <w:rPr>
+                <w:b/>
+                <w:color w:val="FFFFFF"/>
+                <w:sz w:val="16"/>
+              </w:rPr>
+              <w:t>Traditional / manual impact</w:t>
+            </w:r>
+          </w:p>
+        </w:tc>
+        <w:tc>
+          <w:tcPr>
+            <w:tcW w:type="dxa" w:w="2498"/>
+            <w:shd w:fill="0B3A70"/>
+          </w:tcPr>
+          <w:p>
+            <w:pPr>
+              <w:spacing w:after="0"/>
+            </w:pPr>
+            <w:r>
+              <w:rPr>
+                <w:b/>
+                <w:color w:val="FFFFFF"/>
+                <w:sz w:val="16"/>
+              </w:rPr>
+              <w:t>OneFlow capability</w:t>
+            </w:r>
+          </w:p>
+        </w:tc>
+        <w:tc>
+          <w:tcPr>
+            <w:tcW w:type="dxa" w:w="2498"/>
+            <w:shd w:fill="0B3A70"/>
+          </w:tcPr>
+          <w:p>
+            <w:pPr>
+              <w:spacing w:after="0"/>
+            </w:pPr>
+            <w:r>
+              <w:rPr>
+                <w:b/>
+                <w:color w:val="FFFFFF"/>
+                <w:sz w:val="16"/>
+              </w:rPr>
+              <w:t>Prototype result</w:t>
+            </w:r>
+          </w:p>
+        </w:tc>
+        <w:trPr>
+          <w:tblHeader/>
+        </w:trPr>
+      </w:tr>
+      <w:tr>
+        <w:tc>
+          <w:tcPr>
+            <w:tcW w:type="dxa" w:w="2498"/>
+          </w:tcPr>
+          <w:p>
+            <w:pPr>
+              <w:spacing w:after="0"/>
+            </w:pPr>
+            <w:r>
+              <w:rPr>
+                <w:sz w:val="16"/>
+              </w:rPr>
+              <w:t>Fragmented communication</w:t>
+            </w:r>
+          </w:p>
+        </w:tc>
+        <w:tc>
+          <w:tcPr>
+            <w:tcW w:type="dxa" w:w="2498"/>
+          </w:tcPr>
+          <w:p>
+            <w:pPr>
+              <w:spacing w:after="0"/>
+            </w:pPr>
+            <w:r>
+              <w:rPr>
+                <w:sz w:val="16"/>
+              </w:rPr>
+              <w:t>Email and spreadsheets split context</w:t>
+            </w:r>
+          </w:p>
+        </w:tc>
+        <w:tc>
+          <w:tcPr>
+            <w:tcW w:type="dxa" w:w="2498"/>
+          </w:tcPr>
+          <w:p>
+            <w:pPr>
+              <w:spacing w:after="0"/>
+            </w:pPr>
+            <w:r>
+              <w:rPr>
+                <w:sz w:val="16"/>
+              </w:rPr>
+              <w:t>Lifecycle case and mock notifications</w:t>
+            </w:r>
+          </w:p>
+        </w:tc>
+        <w:tc>
+          <w:tcPr>
+            <w:tcW w:type="dxa" w:w="2498"/>
+          </w:tcPr>
+          <w:p>
+            <w:pPr>
+              <w:spacing w:after="0"/>
+            </w:pPr>
+            <w:r>
+              <w:rPr>
+                <w:sz w:val="16"/>
+              </w:rPr>
+              <w:t>Demonstrated</w:t>
             </w:r>
           </w:p>
         </w:tc>
@@ -455,31 +615,461 @@
       <w:tr>
         <w:tc>
           <w:tcPr>
-            <w:tcW w:type="dxa" w:w="3312"/>
+            <w:tcW w:type="dxa" w:w="2498"/>
           </w:tcPr>
           <w:p>
+            <w:pPr>
+              <w:spacing w:after="0"/>
+            </w:pPr>
             <w:r>
-              <w:t>Power Platform</w:t>
+              <w:rPr>
+                <w:sz w:val="16"/>
+              </w:rPr>
+              <w:t>Unclear ownership</w:t>
             </w:r>
           </w:p>
         </w:tc>
         <w:tc>
           <w:tcPr>
-            <w:tcW w:type="dxa" w:w="3312"/>
+            <w:tcW w:type="dxa" w:w="2498"/>
           </w:tcPr>
           <w:p>
+            <w:pPr>
+              <w:spacing w:after="0"/>
+            </w:pPr>
             <w:r>
-              <w:t>Future Integration</w:t>
+              <w:rPr>
+                <w:sz w:val="16"/>
+              </w:rPr>
+              <w:t>Tasks lack a visible owner</w:t>
             </w:r>
           </w:p>
         </w:tc>
         <w:tc>
           <w:tcPr>
-            <w:tcW w:type="dxa" w:w="3312"/>
+            <w:tcW w:type="dxa" w:w="2498"/>
           </w:tcPr>
           <w:p>
+            <w:pPr>
+              <w:spacing w:after="0"/>
+            </w:pPr>
             <w:r>
-              <w:t>Dataverse/Power Automate direction only</w:t>
+              <w:rPr>
+                <w:sz w:val="16"/>
+              </w:rPr>
+              <w:t>Role-based assignment and views</w:t>
+            </w:r>
+          </w:p>
+        </w:tc>
+        <w:tc>
+          <w:tcPr>
+            <w:tcW w:type="dxa" w:w="2498"/>
+          </w:tcPr>
+          <w:p>
+            <w:pPr>
+              <w:spacing w:after="0"/>
+            </w:pPr>
+            <w:r>
+              <w:rPr>
+                <w:sz w:val="16"/>
+              </w:rPr>
+              <w:t>Demonstrated</w:t>
+            </w:r>
+          </w:p>
+        </w:tc>
+      </w:tr>
+      <w:tr>
+        <w:tc>
+          <w:tcPr>
+            <w:tcW w:type="dxa" w:w="2498"/>
+          </w:tcPr>
+          <w:p>
+            <w:pPr>
+              <w:spacing w:after="0"/>
+            </w:pPr>
+            <w:r>
+              <w:rPr>
+                <w:sz w:val="16"/>
+              </w:rPr>
+              <w:t>Manual follow-up</w:t>
+            </w:r>
+          </w:p>
+        </w:tc>
+        <w:tc>
+          <w:tcPr>
+            <w:tcW w:type="dxa" w:w="2498"/>
+          </w:tcPr>
+          <w:p>
+            <w:pPr>
+              <w:spacing w:after="0"/>
+            </w:pPr>
+            <w:r>
+              <w:rPr>
+                <w:sz w:val="16"/>
+              </w:rPr>
+              <w:t>Repeated chasing and escalation</w:t>
+            </w:r>
+          </w:p>
+        </w:tc>
+        <w:tc>
+          <w:tcPr>
+            <w:tcW w:type="dxa" w:w="2498"/>
+          </w:tcPr>
+          <w:p>
+            <w:pPr>
+              <w:spacing w:after="0"/>
+            </w:pPr>
+            <w:r>
+              <w:rPr>
+                <w:sz w:val="16"/>
+              </w:rPr>
+              <w:t>Progress, reminders and simulation</w:t>
+            </w:r>
+          </w:p>
+        </w:tc>
+        <w:tc>
+          <w:tcPr>
+            <w:tcW w:type="dxa" w:w="2498"/>
+          </w:tcPr>
+          <w:p>
+            <w:pPr>
+              <w:spacing w:after="0"/>
+            </w:pPr>
+            <w:r>
+              <w:rPr>
+                <w:sz w:val="16"/>
+              </w:rPr>
+              <w:t>Simulated</w:t>
+            </w:r>
+          </w:p>
+        </w:tc>
+      </w:tr>
+      <w:tr>
+        <w:tc>
+          <w:tcPr>
+            <w:tcW w:type="dxa" w:w="2498"/>
+          </w:tcPr>
+          <w:p>
+            <w:pPr>
+              <w:spacing w:after="0"/>
+            </w:pPr>
+            <w:r>
+              <w:rPr>
+                <w:sz w:val="16"/>
+              </w:rPr>
+              <w:t>Limited visibility</w:t>
+            </w:r>
+          </w:p>
+        </w:tc>
+        <w:tc>
+          <w:tcPr>
+            <w:tcW w:type="dxa" w:w="2498"/>
+          </w:tcPr>
+          <w:p>
+            <w:pPr>
+              <w:spacing w:after="0"/>
+            </w:pPr>
+            <w:r>
+              <w:rPr>
+                <w:sz w:val="16"/>
+              </w:rPr>
+              <w:t>Status is difficult to consolidate</w:t>
+            </w:r>
+          </w:p>
+        </w:tc>
+        <w:tc>
+          <w:tcPr>
+            <w:tcW w:type="dxa" w:w="2498"/>
+          </w:tcPr>
+          <w:p>
+            <w:pPr>
+              <w:spacing w:after="0"/>
+            </w:pPr>
+            <w:r>
+              <w:rPr>
+                <w:sz w:val="16"/>
+              </w:rPr>
+              <w:t>Case progress and reports</w:t>
+            </w:r>
+          </w:p>
+        </w:tc>
+        <w:tc>
+          <w:tcPr>
+            <w:tcW w:type="dxa" w:w="2498"/>
+          </w:tcPr>
+          <w:p>
+            <w:pPr>
+              <w:spacing w:after="0"/>
+            </w:pPr>
+            <w:r>
+              <w:rPr>
+                <w:sz w:val="16"/>
+              </w:rPr>
+              <w:t>Demonstrated</w:t>
+            </w:r>
+          </w:p>
+        </w:tc>
+      </w:tr>
+      <w:tr>
+        <w:tc>
+          <w:tcPr>
+            <w:tcW w:type="dxa" w:w="2498"/>
+          </w:tcPr>
+          <w:p>
+            <w:pPr>
+              <w:spacing w:after="0"/>
+            </w:pPr>
+            <w:r>
+              <w:rPr>
+                <w:sz w:val="16"/>
+              </w:rPr>
+              <w:t>Onboarding readiness</w:t>
+            </w:r>
+          </w:p>
+        </w:tc>
+        <w:tc>
+          <w:tcPr>
+            <w:tcW w:type="dxa" w:w="2498"/>
+          </w:tcPr>
+          <w:p>
+            <w:pPr>
+              <w:spacing w:after="0"/>
+            </w:pPr>
+            <w:r>
+              <w:rPr>
+                <w:sz w:val="16"/>
+              </w:rPr>
+              <w:t>Day-1 work can be missed</w:t>
+            </w:r>
+          </w:p>
+        </w:tc>
+        <w:tc>
+          <w:tcPr>
+            <w:tcW w:type="dxa" w:w="2498"/>
+          </w:tcPr>
+          <w:p>
+            <w:pPr>
+              <w:spacing w:after="0"/>
+            </w:pPr>
+            <w:r>
+              <w:rPr>
+                <w:sz w:val="16"/>
+              </w:rPr>
+              <w:t>Coordinated onboarding checklist</w:t>
+            </w:r>
+          </w:p>
+        </w:tc>
+        <w:tc>
+          <w:tcPr>
+            <w:tcW w:type="dxa" w:w="2498"/>
+          </w:tcPr>
+          <w:p>
+            <w:pPr>
+              <w:spacing w:after="0"/>
+            </w:pPr>
+            <w:r>
+              <w:rPr>
+                <w:sz w:val="16"/>
+              </w:rPr>
+              <w:t>Demonstrated</w:t>
+            </w:r>
+          </w:p>
+        </w:tc>
+      </w:tr>
+      <w:tr>
+        <w:tc>
+          <w:tcPr>
+            <w:tcW w:type="dxa" w:w="2498"/>
+          </w:tcPr>
+          <w:p>
+            <w:pPr>
+              <w:spacing w:after="0"/>
+            </w:pPr>
+            <w:r>
+              <w:rPr>
+                <w:sz w:val="16"/>
+              </w:rPr>
+              <w:t>Offboarding risk</w:t>
+            </w:r>
+          </w:p>
+        </w:tc>
+        <w:tc>
+          <w:tcPr>
+            <w:tcW w:type="dxa" w:w="2498"/>
+          </w:tcPr>
+          <w:p>
+            <w:pPr>
+              <w:spacing w:after="0"/>
+            </w:pPr>
+            <w:r>
+              <w:rPr>
+                <w:sz w:val="16"/>
+              </w:rPr>
+              <w:t>Access/assets can remain open</w:t>
+            </w:r>
+          </w:p>
+        </w:tc>
+        <w:tc>
+          <w:tcPr>
+            <w:tcW w:type="dxa" w:w="2498"/>
+          </w:tcPr>
+          <w:p>
+            <w:pPr>
+              <w:spacing w:after="0"/>
+            </w:pPr>
+            <w:r>
+              <w:rPr>
+                <w:sz w:val="16"/>
+              </w:rPr>
+              <w:t>Exit clearance and task tracking</w:t>
+            </w:r>
+          </w:p>
+        </w:tc>
+        <w:tc>
+          <w:tcPr>
+            <w:tcW w:type="dxa" w:w="2498"/>
+          </w:tcPr>
+          <w:p>
+            <w:pPr>
+              <w:spacing w:after="0"/>
+            </w:pPr>
+            <w:r>
+              <w:rPr>
+                <w:sz w:val="16"/>
+              </w:rPr>
+              <w:t>Demonstrated</w:t>
+            </w:r>
+          </w:p>
+        </w:tc>
+      </w:tr>
+      <w:tr>
+        <w:tc>
+          <w:tcPr>
+            <w:tcW w:type="dxa" w:w="2498"/>
+          </w:tcPr>
+          <w:p>
+            <w:pPr>
+              <w:spacing w:after="0"/>
+            </w:pPr>
+            <w:r>
+              <w:rPr>
+                <w:sz w:val="16"/>
+              </w:rPr>
+              <w:t>Auditability</w:t>
+            </w:r>
+          </w:p>
+        </w:tc>
+        <w:tc>
+          <w:tcPr>
+            <w:tcW w:type="dxa" w:w="2498"/>
+          </w:tcPr>
+          <w:p>
+            <w:pPr>
+              <w:spacing w:after="0"/>
+            </w:pPr>
+            <w:r>
+              <w:rPr>
+                <w:sz w:val="16"/>
+              </w:rPr>
+              <w:t>Evidence is scattered</w:t>
+            </w:r>
+          </w:p>
+        </w:tc>
+        <w:tc>
+          <w:tcPr>
+            <w:tcW w:type="dxa" w:w="2498"/>
+          </w:tcPr>
+          <w:p>
+            <w:pPr>
+              <w:spacing w:after="0"/>
+            </w:pPr>
+            <w:r>
+              <w:rPr>
+                <w:sz w:val="16"/>
+              </w:rPr>
+              <w:t>Activity history and task state</w:t>
+            </w:r>
+          </w:p>
+        </w:tc>
+        <w:tc>
+          <w:tcPr>
+            <w:tcW w:type="dxa" w:w="2498"/>
+          </w:tcPr>
+          <w:p>
+            <w:pPr>
+              <w:spacing w:after="0"/>
+            </w:pPr>
+            <w:r>
+              <w:rPr>
+                <w:sz w:val="16"/>
+              </w:rPr>
+              <w:t>Demonstrated</w:t>
+            </w:r>
+          </w:p>
+        </w:tc>
+      </w:tr>
+      <w:tr>
+        <w:tc>
+          <w:tcPr>
+            <w:tcW w:type="dxa" w:w="2498"/>
+          </w:tcPr>
+          <w:p>
+            <w:pPr>
+              <w:spacing w:after="0"/>
+            </w:pPr>
+            <w:r>
+              <w:rPr>
+                <w:sz w:val="16"/>
+              </w:rPr>
+              <w:t>Reporting</w:t>
+            </w:r>
+          </w:p>
+        </w:tc>
+        <w:tc>
+          <w:tcPr>
+            <w:tcW w:type="dxa" w:w="2498"/>
+          </w:tcPr>
+          <w:p>
+            <w:pPr>
+              <w:spacing w:after="0"/>
+            </w:pPr>
+            <w:r>
+              <w:rPr>
+                <w:sz w:val="16"/>
+              </w:rPr>
+              <w:t>Bottlenecks are opaque</w:t>
+            </w:r>
+          </w:p>
+        </w:tc>
+        <w:tc>
+          <w:tcPr>
+            <w:tcW w:type="dxa" w:w="2498"/>
+          </w:tcPr>
+          <w:p>
+            <w:pPr>
+              <w:spacing w:after="0"/>
+            </w:pPr>
+            <w:r>
+              <w:rPr>
+                <w:sz w:val="16"/>
+              </w:rPr>
+              <w:t>In-app operational snapshot</w:t>
+            </w:r>
+          </w:p>
+        </w:tc>
+        <w:tc>
+          <w:tcPr>
+            <w:tcW w:type="dxa" w:w="2498"/>
+          </w:tcPr>
+          <w:p>
+            <w:pPr>
+              <w:spacing w:after="0"/>
+            </w:pPr>
+            <w:r>
+              <w:rPr>
+                <w:sz w:val="16"/>
+              </w:rPr>
+              <w:t>Demonstrated</w:t>
             </w:r>
           </w:p>
         </w:tc>
@@ -488,6 +1078,22 @@
     <w:p/>
     <w:p>
       <w:pPr>
+        <w:pStyle w:val="Heading2"/>
+      </w:pPr>
+      <w:r>
+        <w:t>Did we solve the challenge?</w:t>
+      </w:r>
+    </w:p>
+    <w:p>
+      <w:pPr>
+        <w:spacing w:after="120"/>
+      </w:pPr>
+      <w:r>
+        <w:t>The prototype successfully demonstrates the concept and end-to-end workflow: lifecycle tasks are centrally coordinated, role ownership is visible, and onboarding/offboarding can be monitored in one portal. Remaining work is enterprise integration, production security, automation, durable persistence, and reporting infrastructure.</w:t>
+      </w:r>
+    </w:p>
+    <w:p>
+      <w:pPr>
         <w:pStyle w:val="Heading1"/>
       </w:pPr>
       <w:r>
@@ -499,7 +1105,7 @@
         <w:spacing w:after="120"/>
       </w:pPr>
       <w:r>
-        <w:t>Employee lifecycle work spans HR, hiring managers, IT Security, onsite IT, facilities, finance, quality, and product stewardship. Email and spreadsheet hand-offs make ownership hard to track and create avoidable delay.</w:t>
+        <w:t>Lifecycle work spans HR, hiring managers, IT Security, onsite IT, facilities, finance, quality, and product stewardship. Disconnected hand-offs create avoidable delay and make completion difficult to prove.</w:t>
       </w:r>
     </w:p>
     <w:p>
@@ -515,7 +1121,7 @@
         <w:spacing w:after="120"/>
       </w:pPr>
       <w:r>
-        <w:t>The prototype combines a Workday-style source screen with a OneFlow portal. Lifecycle events create or update cases; task templates allocate work by role; forms, notifications, progress, and history provide one operational view.</w:t>
+        <w:t>A Workday-style source screen and a OneFlow portal work together in the prototype. Lifecycle events create or update cases; task templates allocate work by role; forms, notifications, progress, and history provide an operational view. Workday remains the HR source system; OneFlow is the orchestration and experience layer.</w:t>
       </w:r>
     </w:p>
     <w:p>
@@ -523,15 +1129,15 @@
         <w:pStyle w:val="Heading1"/>
       </w:pPr>
       <w:r>
-        <w:t>6. Business benefits</w:t>
+        <w:t>6. Benefits</w:t>
       </w:r>
     </w:p>
     <w:p>
       <w:pPr>
-        <w:pStyle w:val="ListBullet"/>
+        <w:pStyle w:val="Heading2"/>
       </w:pPr>
       <w:r>
-        <w:t>Clear cross-functional accountability</w:t>
+        <w:t>HR</w:t>
       </w:r>
     </w:p>
     <w:p>
@@ -539,7 +1145,7 @@
         <w:pStyle w:val="ListBullet"/>
       </w:pPr>
       <w:r>
-        <w:t>Earlier new-hire readiness</w:t>
+        <w:t>Fewer manual follow-ups</w:t>
       </w:r>
     </w:p>
     <w:p>
@@ -547,15 +1153,79 @@
         <w:pStyle w:val="ListBullet"/>
       </w:pPr>
       <w:r>
-        <w:t>Visible offboarding clearance and risk</w:t>
+        <w:t>Clearer lifecycle overview and easier escalation</w:t>
       </w:r>
     </w:p>
     <w:p>
       <w:pPr>
+        <w:pStyle w:val="Heading2"/>
+      </w:pPr>
+      <w:r>
+        <w:t>IT</w:t>
+      </w:r>
+    </w:p>
+    <w:p>
+      <w:pPr>
         <w:pStyle w:val="ListBullet"/>
       </w:pPr>
       <w:r>
-        <w:t>Consistent, auditable task execution</w:t>
+        <w:t>Earlier provisioning visibility</w:t>
+      </w:r>
+    </w:p>
+    <w:p>
+      <w:pPr>
+        <w:pStyle w:val="ListBullet"/>
+      </w:pPr>
+      <w:r>
+        <w:t>Clearer ownership and controlled offboarding access removal</w:t>
+      </w:r>
+    </w:p>
+    <w:p>
+      <w:pPr>
+        <w:pStyle w:val="Heading2"/>
+      </w:pPr>
+      <w:r>
+        <w:t>Hiring Managers and Employees</w:t>
+      </w:r>
+    </w:p>
+    <w:p>
+      <w:pPr>
+        <w:pStyle w:val="ListBullet"/>
+      </w:pPr>
+      <w:r>
+        <w:t>Visibility into readiness</w:t>
+      </w:r>
+    </w:p>
+    <w:p>
+      <w:pPr>
+        <w:pStyle w:val="ListBullet"/>
+      </w:pPr>
+      <w:r>
+        <w:t>Clearer responsibilities and less Day-1 uncertainty</w:t>
+      </w:r>
+    </w:p>
+    <w:p>
+      <w:pPr>
+        <w:pStyle w:val="Heading2"/>
+      </w:pPr>
+      <w:r>
+        <w:t>Management and Organisation</w:t>
+      </w:r>
+    </w:p>
+    <w:p>
+      <w:pPr>
+        <w:pStyle w:val="ListBullet"/>
+      </w:pPr>
+      <w:r>
+        <w:t>Bottleneck visibility and future SLA monitoring</w:t>
+      </w:r>
+    </w:p>
+    <w:p>
+      <w:pPr>
+        <w:pStyle w:val="ListBullet"/>
+      </w:pPr>
+      <w:r>
+        <w:t>Standardisation, traceability, scalability, and reduced operational risk</w:t>
       </w:r>
     </w:p>
     <w:p>
@@ -587,7 +1257,7 @@
         <w:pStyle w:val="ListBullet"/>
       </w:pPr>
       <w:r>
-        <w:t>Task checklists, forms, progress and activity history</w:t>
+        <w:t>Task checklists, forms, progress, and activity history</w:t>
       </w:r>
     </w:p>
     <w:p>
@@ -595,7 +1265,7 @@
         <w:pStyle w:val="ListBullet"/>
       </w:pPr>
       <w:r>
-        <w:t>Mock inbox and configurable email mode</w:t>
+        <w:t>Mock inbox and automation-run simulation</w:t>
       </w:r>
     </w:p>
     <w:p>
@@ -603,7 +1273,15 @@
         <w:pStyle w:val="ListBullet"/>
       </w:pPr>
       <w:r>
-        <w:t>Operational reports and automation-run simulation</w:t>
+        <w:t>Operational reports</w:t>
+      </w:r>
+    </w:p>
+    <w:p>
+      <w:pPr>
+        <w:spacing w:after="120"/>
+      </w:pPr>
+      <w:r>
+        <w:t>Prototype / legacy demo capability: the repository contains optional AWS SES-related configuration from earlier development. It is NOT recommended for production. Production notifications are expected to use the organisation’s Microsoft 365 environment.</w:t>
       </w:r>
     </w:p>
     <w:p>
@@ -622,14 +1300,14 @@
         <w:tblLook w:firstColumn="1" w:firstRow="1" w:lastColumn="0" w:lastRow="0" w:noHBand="0" w:noVBand="1" w:val="04A0"/>
       </w:tblPr>
       <w:tblGrid>
-        <w:gridCol w:w="3312"/>
-        <w:gridCol w:w="3312"/>
-        <w:gridCol w:w="3312"/>
+        <w:gridCol w:w="3331"/>
+        <w:gridCol w:w="3331"/>
+        <w:gridCol w:w="3331"/>
       </w:tblGrid>
       <w:tr>
         <w:tc>
           <w:tcPr>
-            <w:tcW w:type="dxa" w:w="3312"/>
+            <w:tcW w:type="dxa" w:w="3331"/>
             <w:shd w:fill="0B3A70"/>
           </w:tcPr>
           <w:p>
@@ -644,7 +1322,7 @@
         </w:tc>
         <w:tc>
           <w:tcPr>
-            <w:tcW w:type="dxa" w:w="3312"/>
+            <w:tcW w:type="dxa" w:w="3331"/>
             <w:shd w:fill="0B3A70"/>
           </w:tcPr>
           <w:p>
@@ -659,7 +1337,7 @@
         </w:tc>
         <w:tc>
           <w:tcPr>
-            <w:tcW w:type="dxa" w:w="3312"/>
+            <w:tcW w:type="dxa" w:w="3331"/>
             <w:shd w:fill="0B3A70"/>
           </w:tcPr>
           <w:p>
@@ -668,15 +1346,18 @@
                 <w:b/>
                 <w:color w:val="FFFFFF"/>
               </w:rPr>
-              <w:t>Purpose</w:t>
+              <w:t>Demo purpose</w:t>
             </w:r>
           </w:p>
         </w:tc>
+        <w:trPr>
+          <w:tblHeader/>
+        </w:trPr>
       </w:tr>
       <w:tr>
         <w:tc>
           <w:tcPr>
-            <w:tcW w:type="dxa" w:w="3312"/>
+            <w:tcW w:type="dxa" w:w="3331"/>
           </w:tcPr>
           <w:p>
             <w:r>
@@ -686,7 +1367,7 @@
         </w:tc>
         <w:tc>
           <w:tcPr>
-            <w:tcW w:type="dxa" w:w="3312"/>
+            <w:tcW w:type="dxa" w:w="3331"/>
           </w:tcPr>
           <w:p>
             <w:r>
@@ -696,11 +1377,11 @@
         </w:tc>
         <w:tc>
           <w:tcPr>
-            <w:tcW w:type="dxa" w:w="3312"/>
+            <w:tcW w:type="dxa" w:w="3331"/>
           </w:tcPr>
           <w:p>
             <w:r>
-              <w:t>End-to-end</w:t>
+              <w:t>End-to-end walkthrough</w:t>
             </w:r>
           </w:p>
         </w:tc>
@@ -708,7 +1389,7 @@
       <w:tr>
         <w:tc>
           <w:tcPr>
-            <w:tcW w:type="dxa" w:w="3312"/>
+            <w:tcW w:type="dxa" w:w="3331"/>
           </w:tcPr>
           <w:p>
             <w:r>
@@ -718,7 +1399,7 @@
         </w:tc>
         <w:tc>
           <w:tcPr>
-            <w:tcW w:type="dxa" w:w="3312"/>
+            <w:tcW w:type="dxa" w:w="3331"/>
           </w:tcPr>
           <w:p>
             <w:r>
@@ -728,7 +1409,7 @@
         </w:tc>
         <w:tc>
           <w:tcPr>
-            <w:tcW w:type="dxa" w:w="3312"/>
+            <w:tcW w:type="dxa" w:w="3331"/>
           </w:tcPr>
           <w:p>
             <w:r>
@@ -740,7 +1421,7 @@
       <w:tr>
         <w:tc>
           <w:tcPr>
-            <w:tcW w:type="dxa" w:w="3312"/>
+            <w:tcW w:type="dxa" w:w="3331"/>
           </w:tcPr>
           <w:p>
             <w:r>
@@ -750,7 +1431,7 @@
         </w:tc>
         <w:tc>
           <w:tcPr>
-            <w:tcW w:type="dxa" w:w="3312"/>
+            <w:tcW w:type="dxa" w:w="3331"/>
           </w:tcPr>
           <w:p>
             <w:r>
@@ -760,11 +1441,11 @@
         </w:tc>
         <w:tc>
           <w:tcPr>
-            <w:tcW w:type="dxa" w:w="3312"/>
+            <w:tcW w:type="dxa" w:w="3331"/>
           </w:tcPr>
           <w:p>
             <w:r>
-              <w:t>Security</w:t>
+              <w:t>Security work</w:t>
             </w:r>
           </w:p>
         </w:tc>
@@ -772,7 +1453,7 @@
       <w:tr>
         <w:tc>
           <w:tcPr>
-            <w:tcW w:type="dxa" w:w="3312"/>
+            <w:tcW w:type="dxa" w:w="3331"/>
           </w:tcPr>
           <w:p>
             <w:r>
@@ -782,7 +1463,7 @@
         </w:tc>
         <w:tc>
           <w:tcPr>
-            <w:tcW w:type="dxa" w:w="3312"/>
+            <w:tcW w:type="dxa" w:w="3331"/>
           </w:tcPr>
           <w:p>
             <w:r>
@@ -792,11 +1473,11 @@
         </w:tc>
         <w:tc>
           <w:tcPr>
-            <w:tcW w:type="dxa" w:w="3312"/>
+            <w:tcW w:type="dxa" w:w="3331"/>
           </w:tcPr>
           <w:p>
             <w:r>
-              <w:t>Device/access</w:t>
+              <w:t>Device and access</w:t>
             </w:r>
           </w:p>
         </w:tc>
@@ -804,7 +1485,7 @@
       <w:tr>
         <w:tc>
           <w:tcPr>
-            <w:tcW w:type="dxa" w:w="3312"/>
+            <w:tcW w:type="dxa" w:w="3331"/>
           </w:tcPr>
           <w:p>
             <w:r>
@@ -814,7 +1495,7 @@
         </w:tc>
         <w:tc>
           <w:tcPr>
-            <w:tcW w:type="dxa" w:w="3312"/>
+            <w:tcW w:type="dxa" w:w="3331"/>
           </w:tcPr>
           <w:p>
             <w:r>
@@ -824,11 +1505,11 @@
         </w:tc>
         <w:tc>
           <w:tcPr>
-            <w:tcW w:type="dxa" w:w="3312"/>
+            <w:tcW w:type="dxa" w:w="3331"/>
           </w:tcPr>
           <w:p>
             <w:r>
-              <w:t>Workplace</w:t>
+              <w:t>Workplace readiness</w:t>
             </w:r>
           </w:p>
         </w:tc>
@@ -836,7 +1517,7 @@
       <w:tr>
         <w:tc>
           <w:tcPr>
-            <w:tcW w:type="dxa" w:w="3312"/>
+            <w:tcW w:type="dxa" w:w="3331"/>
           </w:tcPr>
           <w:p>
             <w:r>
@@ -846,7 +1527,7 @@
         </w:tc>
         <w:tc>
           <w:tcPr>
-            <w:tcW w:type="dxa" w:w="3312"/>
+            <w:tcW w:type="dxa" w:w="3331"/>
           </w:tcPr>
           <w:p>
             <w:r>
@@ -856,7 +1537,7 @@
         </w:tc>
         <w:tc>
           <w:tcPr>
-            <w:tcW w:type="dxa" w:w="3312"/>
+            <w:tcW w:type="dxa" w:w="3331"/>
           </w:tcPr>
           <w:p>
             <w:r>
@@ -868,7 +1549,7 @@
       <w:tr>
         <w:tc>
           <w:tcPr>
-            <w:tcW w:type="dxa" w:w="3312"/>
+            <w:tcW w:type="dxa" w:w="3331"/>
           </w:tcPr>
           <w:p>
             <w:r>
@@ -878,7 +1559,7 @@
         </w:tc>
         <w:tc>
           <w:tcPr>
-            <w:tcW w:type="dxa" w:w="3312"/>
+            <w:tcW w:type="dxa" w:w="3331"/>
           </w:tcPr>
           <w:p>
             <w:r>
@@ -888,7 +1569,7 @@
         </w:tc>
         <w:tc>
           <w:tcPr>
-            <w:tcW w:type="dxa" w:w="3312"/>
+            <w:tcW w:type="dxa" w:w="3331"/>
           </w:tcPr>
           <w:p>
             <w:r>
@@ -900,7 +1581,7 @@
       <w:tr>
         <w:tc>
           <w:tcPr>
-            <w:tcW w:type="dxa" w:w="3312"/>
+            <w:tcW w:type="dxa" w:w="3331"/>
           </w:tcPr>
           <w:p>
             <w:r>
@@ -910,7 +1591,7 @@
         </w:tc>
         <w:tc>
           <w:tcPr>
-            <w:tcW w:type="dxa" w:w="3312"/>
+            <w:tcW w:type="dxa" w:w="3331"/>
           </w:tcPr>
           <w:p>
             <w:r>
@@ -920,11 +1601,11 @@
         </w:tc>
         <w:tc>
           <w:tcPr>
-            <w:tcW w:type="dxa" w:w="3312"/>
+            <w:tcW w:type="dxa" w:w="3331"/>
           </w:tcPr>
           <w:p>
             <w:r>
-              <w:t>Preboarding</w:t>
+              <w:t>Preboarding journey</w:t>
             </w:r>
           </w:p>
         </w:tc>
@@ -932,7 +1613,7 @@
       <w:tr>
         <w:tc>
           <w:tcPr>
-            <w:tcW w:type="dxa" w:w="3312"/>
+            <w:tcW w:type="dxa" w:w="3331"/>
           </w:tcPr>
           <w:p>
             <w:r>
@@ -942,7 +1623,7 @@
         </w:tc>
         <w:tc>
           <w:tcPr>
-            <w:tcW w:type="dxa" w:w="3312"/>
+            <w:tcW w:type="dxa" w:w="3331"/>
           </w:tcPr>
           <w:p>
             <w:r>
@@ -952,7 +1633,7 @@
         </w:tc>
         <w:tc>
           <w:tcPr>
-            <w:tcW w:type="dxa" w:w="3312"/>
+            <w:tcW w:type="dxa" w:w="3331"/>
           </w:tcPr>
           <w:p>
             <w:r>
@@ -979,15 +1660,15 @@
         <w:tblLook w:firstColumn="1" w:firstRow="1" w:lastColumn="0" w:lastRow="0" w:noHBand="0" w:noVBand="1" w:val="04A0"/>
       </w:tblPr>
       <w:tblGrid>
-        <w:gridCol w:w="2484"/>
-        <w:gridCol w:w="2484"/>
-        <w:gridCol w:w="2484"/>
-        <w:gridCol w:w="2484"/>
+        <w:gridCol w:w="2498"/>
+        <w:gridCol w:w="2498"/>
+        <w:gridCol w:w="2498"/>
+        <w:gridCol w:w="2498"/>
       </w:tblGrid>
       <w:tr>
         <w:tc>
           <w:tcPr>
-            <w:tcW w:type="dxa" w:w="2484"/>
+            <w:tcW w:type="dxa" w:w="2498"/>
             <w:shd w:fill="0B3A70"/>
           </w:tcPr>
           <w:p>
@@ -1002,7 +1683,7 @@
         </w:tc>
         <w:tc>
           <w:tcPr>
-            <w:tcW w:type="dxa" w:w="2484"/>
+            <w:tcW w:type="dxa" w:w="2498"/>
             <w:shd w:fill="0B3A70"/>
           </w:tcPr>
           <w:p>
@@ -1017,7 +1698,7 @@
         </w:tc>
         <w:tc>
           <w:tcPr>
-            <w:tcW w:type="dxa" w:w="2484"/>
+            <w:tcW w:type="dxa" w:w="2498"/>
             <w:shd w:fill="0B3A70"/>
           </w:tcPr>
           <w:p>
@@ -1032,7 +1713,7 @@
         </w:tc>
         <w:tc>
           <w:tcPr>
-            <w:tcW w:type="dxa" w:w="2484"/>
+            <w:tcW w:type="dxa" w:w="2498"/>
             <w:shd w:fill="0B3A70"/>
           </w:tcPr>
           <w:p>
@@ -1045,11 +1726,14 @@
             </w:r>
           </w:p>
         </w:tc>
+        <w:trPr>
+          <w:tblHeader/>
+        </w:trPr>
       </w:tr>
       <w:tr>
         <w:tc>
           <w:tcPr>
-            <w:tcW w:type="dxa" w:w="2484"/>
+            <w:tcW w:type="dxa" w:w="2498"/>
           </w:tcPr>
           <w:p>
             <w:r>
@@ -1059,7 +1743,7 @@
         </w:tc>
         <w:tc>
           <w:tcPr>
-            <w:tcW w:type="dxa" w:w="2484"/>
+            <w:tcW w:type="dxa" w:w="2498"/>
           </w:tcPr>
           <w:p>
             <w:r>
@@ -1069,7 +1753,7 @@
         </w:tc>
         <w:tc>
           <w:tcPr>
-            <w:tcW w:type="dxa" w:w="2484"/>
+            <w:tcW w:type="dxa" w:w="2498"/>
           </w:tcPr>
           <w:p>
             <w:r>
@@ -1079,7 +1763,7 @@
         </w:tc>
         <w:tc>
           <w:tcPr>
-            <w:tcW w:type="dxa" w:w="2484"/>
+            <w:tcW w:type="dxa" w:w="2498"/>
           </w:tcPr>
           <w:p>
             <w:r>
@@ -1091,7 +1775,7 @@
       <w:tr>
         <w:tc>
           <w:tcPr>
-            <w:tcW w:type="dxa" w:w="2484"/>
+            <w:tcW w:type="dxa" w:w="2498"/>
           </w:tcPr>
           <w:p>
             <w:r>
@@ -1101,7 +1785,7 @@
         </w:tc>
         <w:tc>
           <w:tcPr>
-            <w:tcW w:type="dxa" w:w="2484"/>
+            <w:tcW w:type="dxa" w:w="2498"/>
           </w:tcPr>
           <w:p>
             <w:r>
@@ -1111,7 +1795,7 @@
         </w:tc>
         <w:tc>
           <w:tcPr>
-            <w:tcW w:type="dxa" w:w="2484"/>
+            <w:tcW w:type="dxa" w:w="2498"/>
           </w:tcPr>
           <w:p>
             <w:r>
@@ -1121,7 +1805,7 @@
         </w:tc>
         <w:tc>
           <w:tcPr>
-            <w:tcW w:type="dxa" w:w="2484"/>
+            <w:tcW w:type="dxa" w:w="2498"/>
           </w:tcPr>
           <w:p>
             <w:r>
@@ -1133,7 +1817,7 @@
       <w:tr>
         <w:tc>
           <w:tcPr>
-            <w:tcW w:type="dxa" w:w="2484"/>
+            <w:tcW w:type="dxa" w:w="2498"/>
           </w:tcPr>
           <w:p>
             <w:r>
@@ -1143,7 +1827,7 @@
         </w:tc>
         <w:tc>
           <w:tcPr>
-            <w:tcW w:type="dxa" w:w="2484"/>
+            <w:tcW w:type="dxa" w:w="2498"/>
           </w:tcPr>
           <w:p>
             <w:r>
@@ -1153,7 +1837,7 @@
         </w:tc>
         <w:tc>
           <w:tcPr>
-            <w:tcW w:type="dxa" w:w="2484"/>
+            <w:tcW w:type="dxa" w:w="2498"/>
           </w:tcPr>
           <w:p>
             <w:r>
@@ -1163,7 +1847,7 @@
         </w:tc>
         <w:tc>
           <w:tcPr>
-            <w:tcW w:type="dxa" w:w="2484"/>
+            <w:tcW w:type="dxa" w:w="2498"/>
           </w:tcPr>
           <w:p>
             <w:r>
@@ -1175,7 +1859,7 @@
       <w:tr>
         <w:tc>
           <w:tcPr>
-            <w:tcW w:type="dxa" w:w="2484"/>
+            <w:tcW w:type="dxa" w:w="2498"/>
           </w:tcPr>
           <w:p>
             <w:r>
@@ -1185,7 +1869,7 @@
         </w:tc>
         <w:tc>
           <w:tcPr>
-            <w:tcW w:type="dxa" w:w="2484"/>
+            <w:tcW w:type="dxa" w:w="2498"/>
           </w:tcPr>
           <w:p>
             <w:r>
@@ -1195,7 +1879,7 @@
         </w:tc>
         <w:tc>
           <w:tcPr>
-            <w:tcW w:type="dxa" w:w="2484"/>
+            <w:tcW w:type="dxa" w:w="2498"/>
           </w:tcPr>
           <w:p>
             <w:r>
@@ -1205,7 +1889,7 @@
         </w:tc>
         <w:tc>
           <w:tcPr>
-            <w:tcW w:type="dxa" w:w="2484"/>
+            <w:tcW w:type="dxa" w:w="2498"/>
           </w:tcPr>
           <w:p>
             <w:r>
@@ -1217,7 +1901,7 @@
       <w:tr>
         <w:tc>
           <w:tcPr>
-            <w:tcW w:type="dxa" w:w="2484"/>
+            <w:tcW w:type="dxa" w:w="2498"/>
           </w:tcPr>
           <w:p>
             <w:r>
@@ -1227,7 +1911,7 @@
         </w:tc>
         <w:tc>
           <w:tcPr>
-            <w:tcW w:type="dxa" w:w="2484"/>
+            <w:tcW w:type="dxa" w:w="2498"/>
           </w:tcPr>
           <w:p>
             <w:r>
@@ -1237,7 +1921,7 @@
         </w:tc>
         <w:tc>
           <w:tcPr>
-            <w:tcW w:type="dxa" w:w="2484"/>
+            <w:tcW w:type="dxa" w:w="2498"/>
           </w:tcPr>
           <w:p>
             <w:r>
@@ -1247,7 +1931,7 @@
         </w:tc>
         <w:tc>
           <w:tcPr>
-            <w:tcW w:type="dxa" w:w="2484"/>
+            <w:tcW w:type="dxa" w:w="2498"/>
           </w:tcPr>
           <w:p>
             <w:r>
@@ -1263,47 +1947,47 @@
         <w:pStyle w:val="Heading1"/>
       </w:pPr>
       <w:r>
-        <w:t>10. User manual</w:t>
+        <w:t>10. Portal capabilities</w:t>
       </w:r>
     </w:p>
     <w:p>
       <w:pPr>
-        <w:spacing w:after="120"/>
+        <w:pStyle w:val="Heading2"/>
       </w:pPr>
       <w:r>
-        <w:t>Sign in at /login using a demo profile, then use the Workday mock or OneFlow navigation. This is browser-local prototype data and must not be used for real employee records.</w:t>
+        <w:t>PPG Workday Demo Portal</w:t>
       </w:r>
     </w:p>
     <w:p>
       <w:pPr>
-        <w:pStyle w:val="Heading2"/>
+        <w:spacing w:after="120"/>
       </w:pPr>
       <w:r>
-        <w:t>10.1 Admin</w:t>
+        <w:t>This is a mock HR source application, not the real Workday environment; no production Workday API is connected. Users can view the worker population and worker details including department, position, location, start date, and lifecycle status (Active, Preboarding, or Offboarding). Where supported, it can demonstrate worker and lifecycle changes that OneFlow uses in the prototype.</w:t>
       </w:r>
     </w:p>
     <w:p>
       <w:pPr>
-        <w:spacing w:after="120"/>
+        <w:pStyle w:val="Heading2"/>
       </w:pPr>
       <w:r>
-        <w:t>Review cases, automation, settings and reports.</w:t>
+        <w:t>OneFlow Portal</w:t>
       </w:r>
     </w:p>
     <w:p>
       <w:pPr>
-        <w:pStyle w:val="Heading2"/>
+        <w:spacing w:after="120"/>
       </w:pPr>
       <w:r>
-        <w:t>10.2 HR</w:t>
+        <w:t>OneFlow provides lifecycle case management, onboarding and offboarding journeys, role-based responsibility, assigned tasks, completion tracking, forms, mock notifications, activity history, progress visibility, operational reports, automation simulation, and role-specific views.</w:t>
       </w:r>
     </w:p>
     <w:p>
       <w:pPr>
-        <w:spacing w:after="120"/>
+        <w:pStyle w:val="Heading1"/>
       </w:pPr>
       <w:r>
-        <w:t>Validate worker details and coordinate lifecycle work.</w:t>
+        <w:t>11. User manual</w:t>
       </w:r>
     </w:p>
     <w:p>
@@ -1311,7 +1995,7 @@
         <w:pStyle w:val="Heading2"/>
       </w:pPr>
       <w:r>
-        <w:t>10.3 IT Security</w:t>
+        <w:t>11.1 Accessing OneFlow</w:t>
       </w:r>
     </w:p>
     <w:p>
@@ -1319,119 +2003,7 @@
         <w:spacing w:after="120"/>
       </w:pPr>
       <w:r>
-        <w:t>Complete security/access work.</w:t>
-      </w:r>
-    </w:p>
-    <w:p>
-      <w:pPr>
-        <w:pStyle w:val="Heading2"/>
-      </w:pPr>
-      <w:r>
-        <w:t>10.4 Onsite IT</w:t>
-      </w:r>
-    </w:p>
-    <w:p>
-      <w:pPr>
-        <w:spacing w:after="120"/>
-      </w:pPr>
-      <w:r>
-        <w:t>Prepare/recover equipment.</w:t>
-      </w:r>
-    </w:p>
-    <w:p>
-      <w:pPr>
-        <w:pStyle w:val="Heading2"/>
-      </w:pPr>
-      <w:r>
-        <w:t>10.5 Facilities</w:t>
-      </w:r>
-    </w:p>
-    <w:p>
-      <w:pPr>
-        <w:spacing w:after="120"/>
-      </w:pPr>
-      <w:r>
-        <w:t>Complete site-access and EHS work.</w:t>
-      </w:r>
-    </w:p>
-    <w:p>
-      <w:pPr>
-        <w:pStyle w:val="Heading2"/>
-      </w:pPr>
-      <w:r>
-        <w:t>10.6 Hiring Manager</w:t>
-      </w:r>
-    </w:p>
-    <w:p>
-      <w:pPr>
-        <w:spacing w:after="120"/>
-      </w:pPr>
-      <w:r>
-        <w:t>Confirm team readiness.</w:t>
-      </w:r>
-    </w:p>
-    <w:p>
-      <w:pPr>
-        <w:pStyle w:val="Heading2"/>
-      </w:pPr>
-      <w:r>
-        <w:t>10.7 Finance</w:t>
-      </w:r>
-    </w:p>
-    <w:p>
-      <w:pPr>
-        <w:spacing w:after="120"/>
-      </w:pPr>
-      <w:r>
-        <w:t>Complete finance tasks.</w:t>
-      </w:r>
-    </w:p>
-    <w:p>
-      <w:pPr>
-        <w:pStyle w:val="Heading2"/>
-      </w:pPr>
-      <w:r>
-        <w:t>10.8 Quality</w:t>
-      </w:r>
-    </w:p>
-    <w:p>
-      <w:pPr>
-        <w:spacing w:after="120"/>
-      </w:pPr>
-      <w:r>
-        <w:t>Complete quality acknowledgement.</w:t>
-      </w:r>
-    </w:p>
-    <w:p>
-      <w:pPr>
-        <w:pStyle w:val="Heading2"/>
-      </w:pPr>
-      <w:r>
-        <w:t>10.9 Product Stewardship</w:t>
-      </w:r>
-    </w:p>
-    <w:p>
-      <w:pPr>
-        <w:spacing w:after="120"/>
-      </w:pPr>
-      <w:r>
-        <w:t>Complete stewardship acknowledgement.</w:t>
-      </w:r>
-    </w:p>
-    <w:p>
-      <w:pPr>
-        <w:pStyle w:val="Heading2"/>
-      </w:pPr>
-      <w:r>
-        <w:t>10.10 Employee</w:t>
-      </w:r>
-    </w:p>
-    <w:p>
-      <w:pPr>
-        <w:spacing w:after="120"/>
-      </w:pPr>
-      <w:r>
-        <w:t>Complete assigned forms.</w:t>
+        <w:t>Open https://oneflow.highrulez.com. This is the official hackathon demo URL. On the login page, use Demo Account Quick Login to select a role. The dashboard presents relevant work and navigation; switch roles by returning to the login flow.</w:t>
       </w:r>
     </w:p>
     <w:tbl>
@@ -1441,25 +2013,140 @@
         <w:tblLook w:firstColumn="1" w:firstRow="1" w:lastColumn="0" w:lastRow="0" w:noHBand="0" w:noVBand="1" w:val="04A0"/>
       </w:tblPr>
       <w:tblGrid>
-        <w:gridCol w:w="9936"/>
+        <w:gridCol w:w="9994"/>
       </w:tblGrid>
       <w:tr>
         <w:tc>
           <w:tcPr>
-            <w:tcW w:type="dxa" w:w="9936"/>
+            <w:tcW w:type="dxa" w:w="9994"/>
             <w:shd w:fill="FFF4CE"/>
           </w:tcPr>
           <w:p>
             <w:r>
-              <w:t>SCREENSHOT PLACEHOLDER — Login page and role selector</w:t>
+              <w:t>SCREENSHOT PLACEHOLDER — Login page and Demo Account Quick Login</w:t>
               <w:br/>
-              <w:t>Capture from the running prototype before a presentation or handover.</w:t>
+              <w:t>Capture from the running hackathon demo before presentation or handover.</w:t>
             </w:r>
           </w:p>
         </w:tc>
+        <w:trPr>
+          <w:tblHeader/>
+        </w:trPr>
       </w:tr>
     </w:tbl>
     <w:p/>
+    <w:p>
+      <w:pPr>
+        <w:pStyle w:val="Heading2"/>
+      </w:pPr>
+      <w:r>
+        <w:t>11.2 Dashboard</w:t>
+      </w:r>
+    </w:p>
+    <w:p>
+      <w:pPr>
+        <w:spacing w:after="120"/>
+      </w:pPr>
+      <w:r>
+        <w:t>Review assigned work, case summaries, unread mock notifications, and navigation cards.</w:t>
+      </w:r>
+    </w:p>
+    <w:p>
+      <w:pPr>
+        <w:pStyle w:val="Heading2"/>
+      </w:pPr>
+      <w:r>
+        <w:t>11.3 Workday demo</w:t>
+      </w:r>
+    </w:p>
+    <w:p>
+      <w:pPr>
+        <w:spacing w:after="120"/>
+      </w:pPr>
+      <w:r>
+        <w:t>Open the Workday Demo Portal to view workers or inspect employee details and lifecycle status.</w:t>
+      </w:r>
+    </w:p>
+    <w:p>
+      <w:pPr>
+        <w:pStyle w:val="Heading2"/>
+      </w:pPr>
+      <w:r>
+        <w:t>11.4 Lifecycle cases</w:t>
+      </w:r>
+    </w:p>
+    <w:p>
+      <w:pPr>
+        <w:spacing w:after="120"/>
+      </w:pPr>
+      <w:r>
+        <w:t>Open a case to review employee context, task status, ownership, progress, forms, notifications, and activity history.</w:t>
+      </w:r>
+    </w:p>
+    <w:p>
+      <w:pPr>
+        <w:pStyle w:val="Heading2"/>
+      </w:pPr>
+      <w:r>
+        <w:t>11.5 Tasks and forms</w:t>
+      </w:r>
+    </w:p>
+    <w:p>
+      <w:pPr>
+        <w:spacing w:after="120"/>
+      </w:pPr>
+      <w:r>
+        <w:t>Open an assigned task or form, complete the permitted information, then submit or mark the task complete where enabled.</w:t>
+      </w:r>
+    </w:p>
+    <w:p>
+      <w:pPr>
+        <w:pStyle w:val="Heading2"/>
+      </w:pPr>
+      <w:r>
+        <w:t>11.6 Progress, notifications and history</w:t>
+      </w:r>
+    </w:p>
+    <w:p>
+      <w:pPr>
+        <w:spacing w:after="120"/>
+      </w:pPr>
+      <w:r>
+        <w:t>Completion updates case progress. The mock inbox and activity history provide prototype audit visibility.</w:t>
+      </w:r>
+    </w:p>
+    <w:p>
+      <w:pPr>
+        <w:pStyle w:val="Heading2"/>
+      </w:pPr>
+      <w:r>
+        <w:t>11.7 Reports and automation simulation</w:t>
+      </w:r>
+    </w:p>
+    <w:p>
+      <w:pPr>
+        <w:spacing w:after="120"/>
+      </w:pPr>
+      <w:r>
+        <w:t>Use in-app reports for operational snapshot views; automation runs demonstrate simulation only, not live Power Automate.</w:t>
+      </w:r>
+    </w:p>
+    <w:p>
+      <w:pPr>
+        <w:pStyle w:val="Heading2"/>
+      </w:pPr>
+      <w:r>
+        <w:t>11.8 Logout or role switching</w:t>
+      </w:r>
+    </w:p>
+    <w:p>
+      <w:pPr>
+        <w:spacing w:after="120"/>
+      </w:pPr>
+      <w:r>
+        <w:t>Use the application session controls or return to login, then select the appropriate demo role.</w:t>
+      </w:r>
+    </w:p>
     <w:tbl>
       <w:tblPr>
         <w:tblStyle w:val="TableGrid"/>
@@ -1467,22 +2154,25 @@
         <w:tblLook w:firstColumn="1" w:firstRow="1" w:lastColumn="0" w:lastRow="0" w:noHBand="0" w:noVBand="1" w:val="04A0"/>
       </w:tblPr>
       <w:tblGrid>
-        <w:gridCol w:w="9936"/>
+        <w:gridCol w:w="9994"/>
       </w:tblGrid>
       <w:tr>
         <w:tc>
           <w:tcPr>
-            <w:tcW w:type="dxa" w:w="9936"/>
+            <w:tcW w:type="dxa" w:w="9994"/>
             <w:shd w:fill="FFF4CE"/>
           </w:tcPr>
           <w:p>
             <w:r>
-              <w:t>SCREENSHOT PLACEHOLDER — Case detail with task progress</w:t>
+              <w:t>SCREENSHOT PLACEHOLDER — OneFlow case detail, tasks, progress, and activity history</w:t>
               <w:br/>
-              <w:t>Capture from the running prototype before a presentation or handover.</w:t>
+              <w:t>Capture from the running hackathon demo before presentation or handover.</w:t>
             </w:r>
           </w:p>
         </w:tc>
+        <w:trPr>
+          <w:tblHeader/>
+        </w:trPr>
       </w:tr>
     </w:tbl>
     <w:p/>
@@ -1491,310 +2181,217 @@
         <w:pStyle w:val="Heading1"/>
       </w:pPr>
       <w:r>
-        <w:t>11. Onboarding scenario — Aziz, Nabila</w:t>
+        <w:t>12. Role manuals</w:t>
       </w:r>
     </w:p>
     <w:p>
       <w:pPr>
-        <w:spacing w:after="120"/>
+        <w:pStyle w:val="Heading2"/>
       </w:pPr>
       <w:r>
-        <w:t>Nabila Aziz is the main onboarding employee. Her status is Preboarding and her start date is dynamically set to ten business days ahead, keeping the scenario current. Use her case to show tasks, forms, inbox items, progress, and activity history.</w:t>
+        <w:t>12.1 OneFlow Admin</w:t>
       </w:r>
     </w:p>
     <w:p>
       <w:pPr>
-        <w:pStyle w:val="Heading1"/>
+        <w:spacing w:after="120"/>
       </w:pPr>
       <w:r>
-        <w:t>12. Offboarding scenario — Hamdan, Muhamad Asyraf Naqiyuddin</w:t>
+        <w:t>Purpose: participate in the lifecycle workflow. What the user can see: Sees dashboards, settings, reports, demo controls, cases and simulation history. What the user can do: Review the overall demo, reset seeded data where available, inspect cases, reports and automation runs. Typical workflow: open assigned work, review instructions, complete permitted action, and return to the case. What happens after completion: After task completion, the case progress, history, and role views update.</w:t>
       </w:r>
     </w:p>
     <w:p>
       <w:pPr>
-        <w:spacing w:after="120"/>
+        <w:pStyle w:val="Heading2"/>
       </w:pPr>
       <w:r>
-        <w:t>Hamdan is the main offboarding employee. His employment began 13 June 2022 and the demo uses an upcoming last-working-day scenario. Use his case to show exit clearance, asset return, access removal, notifications, and audit activity.</w:t>
+        <w:t>12.2 HR</w:t>
       </w:r>
     </w:p>
     <w:p>
       <w:pPr>
-        <w:pStyle w:val="Heading1"/>
+        <w:spacing w:after="120"/>
       </w:pPr>
       <w:r>
-        <w:t>13. Workday mock</w:t>
+        <w:t>Purpose: participate in the lifecycle workflow. What the user can see: Sees HR lifecycle work, worker and case context. What the user can do: Coordinate worker details and track onboarding/offboarding readiness. Typical workflow: open assigned work, review instructions, complete permitted action, and return to the case. What happens after completion: Completion is recorded in the case and visible to the owning teams.</w:t>
       </w:r>
     </w:p>
     <w:p>
       <w:pPr>
-        <w:spacing w:after="120"/>
+        <w:pStyle w:val="Heading2"/>
       </w:pPr>
       <w:r>
-        <w:t>The Workday area is a mock source application for worker create/edit and lifecycle status demonstration. It has no live Workday connection and persists only in browser local storage.</w:t>
+        <w:t>12.3 Hiring Manager</w:t>
       </w:r>
     </w:p>
     <w:p>
       <w:pPr>
-        <w:pStyle w:val="Heading1"/>
+        <w:spacing w:after="120"/>
       </w:pPr>
       <w:r>
-        <w:t>14. Role and responsibility matrix</w:t>
+        <w:t>Purpose: participate in the lifecycle workflow. What the user can see: Sees manager-owned employee readiness work. What the user can do: Complete assigned team, buddy, training or schedule activities where present. Typical workflow: open assigned work, review instructions, complete permitted action, and return to the case. What happens after completion: The lifecycle case progress is updated.</w:t>
       </w:r>
     </w:p>
-    <w:tbl>
-      <w:tblPr>
-        <w:tblStyle w:val="TableGrid"/>
-        <w:tblW w:type="auto" w:w="0"/>
-        <w:jc w:val="center"/>
-        <w:tblLook w:firstColumn="1" w:firstRow="1" w:lastColumn="0" w:lastRow="0" w:noHBand="0" w:noVBand="1" w:val="04A0"/>
-      </w:tblPr>
-      <w:tblGrid>
-        <w:gridCol w:w="3312"/>
-        <w:gridCol w:w="3312"/>
-        <w:gridCol w:w="3312"/>
-      </w:tblGrid>
-      <w:tr>
-        <w:tc>
-          <w:tcPr>
-            <w:tcW w:type="dxa" w:w="3312"/>
-            <w:shd w:fill="0B3A70"/>
-          </w:tcPr>
-          <w:p>
-            <w:r>
-              <w:rPr>
-                <w:b/>
-                <w:color w:val="FFFFFF"/>
-              </w:rPr>
-              <w:t>Role</w:t>
-            </w:r>
-          </w:p>
-        </w:tc>
-        <w:tc>
-          <w:tcPr>
-            <w:tcW w:type="dxa" w:w="3312"/>
-            <w:shd w:fill="0B3A70"/>
-          </w:tcPr>
-          <w:p>
-            <w:r>
-              <w:rPr>
-                <w:b/>
-                <w:color w:val="FFFFFF"/>
-              </w:rPr>
-              <w:t>Onboarding</w:t>
-            </w:r>
-          </w:p>
-        </w:tc>
-        <w:tc>
-          <w:tcPr>
-            <w:tcW w:type="dxa" w:w="3312"/>
-            <w:shd w:fill="0B3A70"/>
-          </w:tcPr>
-          <w:p>
-            <w:r>
-              <w:rPr>
-                <w:b/>
-                <w:color w:val="FFFFFF"/>
-              </w:rPr>
-              <w:t>Offboarding</w:t>
-            </w:r>
-          </w:p>
-        </w:tc>
-      </w:tr>
-      <w:tr>
-        <w:tc>
-          <w:tcPr>
-            <w:tcW w:type="dxa" w:w="3312"/>
-          </w:tcPr>
-          <w:p>
-            <w:r>
-              <w:t>HR</w:t>
-            </w:r>
-          </w:p>
-        </w:tc>
-        <w:tc>
-          <w:tcPr>
-            <w:tcW w:type="dxa" w:w="3312"/>
-          </w:tcPr>
-          <w:p>
-            <w:r>
-              <w:t>Own lifecycle case</w:t>
-            </w:r>
-          </w:p>
-        </w:tc>
-        <w:tc>
-          <w:tcPr>
-            <w:tcW w:type="dxa" w:w="3312"/>
-          </w:tcPr>
-          <w:p>
-            <w:r>
-              <w:t>Initiate and verify exit</w:t>
-            </w:r>
-          </w:p>
-        </w:tc>
-      </w:tr>
-      <w:tr>
-        <w:tc>
-          <w:tcPr>
-            <w:tcW w:type="dxa" w:w="3312"/>
-          </w:tcPr>
-          <w:p>
-            <w:r>
-              <w:t>IT Security</w:t>
-            </w:r>
-          </w:p>
-        </w:tc>
-        <w:tc>
-          <w:tcPr>
-            <w:tcW w:type="dxa" w:w="3312"/>
-          </w:tcPr>
-          <w:p>
-            <w:r>
-              <w:t>Provision access</w:t>
-            </w:r>
-          </w:p>
-        </w:tc>
-        <w:tc>
-          <w:tcPr>
-            <w:tcW w:type="dxa" w:w="3312"/>
-          </w:tcPr>
-          <w:p>
-            <w:r>
-              <w:t>Remove access</w:t>
-            </w:r>
-          </w:p>
-        </w:tc>
-      </w:tr>
-      <w:tr>
-        <w:tc>
-          <w:tcPr>
-            <w:tcW w:type="dxa" w:w="3312"/>
-          </w:tcPr>
-          <w:p>
-            <w:r>
-              <w:t>Onsite IT</w:t>
-            </w:r>
-          </w:p>
-        </w:tc>
-        <w:tc>
-          <w:tcPr>
-            <w:tcW w:type="dxa" w:w="3312"/>
-          </w:tcPr>
-          <w:p>
-            <w:r>
-              <w:t>Prepare device</w:t>
-            </w:r>
-          </w:p>
-        </w:tc>
-        <w:tc>
-          <w:tcPr>
-            <w:tcW w:type="dxa" w:w="3312"/>
-          </w:tcPr>
-          <w:p>
-            <w:r>
-              <w:t>Recover assets</w:t>
-            </w:r>
-          </w:p>
-        </w:tc>
-      </w:tr>
-      <w:tr>
-        <w:tc>
-          <w:tcPr>
-            <w:tcW w:type="dxa" w:w="3312"/>
-          </w:tcPr>
-          <w:p>
-            <w:r>
-              <w:t>Facilities</w:t>
-            </w:r>
-          </w:p>
-        </w:tc>
-        <w:tc>
-          <w:tcPr>
-            <w:tcW w:type="dxa" w:w="3312"/>
-          </w:tcPr>
-          <w:p>
-            <w:r>
-              <w:t>Prepare site access</w:t>
-            </w:r>
-          </w:p>
-        </w:tc>
-        <w:tc>
-          <w:tcPr>
-            <w:tcW w:type="dxa" w:w="3312"/>
-          </w:tcPr>
-          <w:p>
-            <w:r>
-              <w:t>Clear facilities items</w:t>
-            </w:r>
-          </w:p>
-        </w:tc>
-      </w:tr>
-      <w:tr>
-        <w:tc>
-          <w:tcPr>
-            <w:tcW w:type="dxa" w:w="3312"/>
-          </w:tcPr>
-          <w:p>
-            <w:r>
-              <w:t>Hiring Manager</w:t>
-            </w:r>
-          </w:p>
-        </w:tc>
-        <w:tc>
-          <w:tcPr>
-            <w:tcW w:type="dxa" w:w="3312"/>
-          </w:tcPr>
-          <w:p>
-            <w:r>
-              <w:t>Confirm readiness</w:t>
-            </w:r>
-          </w:p>
-        </w:tc>
-        <w:tc>
-          <w:tcPr>
-            <w:tcW w:type="dxa" w:w="3312"/>
-          </w:tcPr>
-          <w:p>
-            <w:r>
-              <w:t>Confirm transition</w:t>
-            </w:r>
-          </w:p>
-        </w:tc>
-      </w:tr>
-      <w:tr>
-        <w:tc>
-          <w:tcPr>
-            <w:tcW w:type="dxa" w:w="3312"/>
-          </w:tcPr>
-          <w:p>
-            <w:r>
-              <w:t>Finance</w:t>
-            </w:r>
-          </w:p>
-        </w:tc>
-        <w:tc>
-          <w:tcPr>
-            <w:tcW w:type="dxa" w:w="3312"/>
-          </w:tcPr>
-          <w:p>
-            <w:r>
-              <w:t>Complete finance tasks</w:t>
-            </w:r>
-          </w:p>
-        </w:tc>
-        <w:tc>
-          <w:tcPr>
-            <w:tcW w:type="dxa" w:w="3312"/>
-          </w:tcPr>
-          <w:p>
-            <w:r>
-              <w:t>Close finance items</w:t>
-            </w:r>
-          </w:p>
-        </w:tc>
-      </w:tr>
-    </w:tbl>
-    <w:p/>
+    <w:p>
+      <w:pPr>
+        <w:pStyle w:val="Heading2"/>
+      </w:pPr>
+      <w:r>
+        <w:t>12.4 Onsite IT</w:t>
+      </w:r>
+    </w:p>
+    <w:p>
+      <w:pPr>
+        <w:spacing w:after="120"/>
+      </w:pPr>
+      <w:r>
+        <w:t>Purpose: participate in the lifecycle workflow. What the user can see: Sees device and onsite technical tasks. What the user can do: Prepare/recover equipment and update assigned task status. Typical workflow: open assigned work, review instructions, complete permitted action, and return to the case. What happens after completion: Status is reflected in the case.</w:t>
+      </w:r>
+    </w:p>
+    <w:p>
+      <w:pPr>
+        <w:pStyle w:val="Heading2"/>
+      </w:pPr>
+      <w:r>
+        <w:t>12.5 IT Security</w:t>
+      </w:r>
+    </w:p>
+    <w:p>
+      <w:pPr>
+        <w:spacing w:after="120"/>
+      </w:pPr>
+      <w:r>
+        <w:t>Purpose: participate in the lifecycle workflow. What the user can see: Sees security and access tasks. What the user can do: Complete assigned security/access actions and record task progress. Typical workflow: open assigned work, review instructions, complete permitted action, and return to the case. What happens after completion: Status is reflected in case history.</w:t>
+      </w:r>
+    </w:p>
+    <w:p>
+      <w:pPr>
+        <w:pStyle w:val="Heading2"/>
+      </w:pPr>
+      <w:r>
+        <w:t>12.6 Finance</w:t>
+      </w:r>
+    </w:p>
+    <w:p>
+      <w:pPr>
+        <w:spacing w:after="120"/>
+      </w:pPr>
+      <w:r>
+        <w:t>Purpose: participate in the lifecycle workflow. What the user can see: Sees assigned finance work. What the user can do: Complete relevant assigned finance items. Typical workflow: open assigned work, review instructions, complete permitted action, and return to the case. What happens after completion: Status is reflected in the lifecycle case.</w:t>
+      </w:r>
+    </w:p>
+    <w:p>
+      <w:pPr>
+        <w:pStyle w:val="Heading2"/>
+      </w:pPr>
+      <w:r>
+        <w:t>12.7 Facilities</w:t>
+      </w:r>
+    </w:p>
+    <w:p>
+      <w:pPr>
+        <w:spacing w:after="120"/>
+      </w:pPr>
+      <w:r>
+        <w:t>Purpose: participate in the lifecycle workflow. What the user can see: Sees workplace readiness or clearance tasks. What the user can do: Complete access card, parking, building, or EHS work where assigned. Typical workflow: open assigned work, review instructions, complete permitted action, and return to the case. What happens after completion: Status is reflected in the lifecycle case.</w:t>
+      </w:r>
+    </w:p>
+    <w:p>
+      <w:pPr>
+        <w:pStyle w:val="Heading2"/>
+      </w:pPr>
+      <w:r>
+        <w:t>12.8 Quality</w:t>
+      </w:r>
+    </w:p>
+    <w:p>
+      <w:pPr>
+        <w:spacing w:after="120"/>
+      </w:pPr>
+      <w:r>
+        <w:t>Purpose: participate in the lifecycle workflow. What the user can see: Sees quality acknowledgement work where assigned. What the user can do: Complete the assigned acknowledgement/task. Typical workflow: open assigned work, review instructions, complete permitted action, and return to the case. What happens after completion: Status is reflected in the lifecycle case.</w:t>
+      </w:r>
+    </w:p>
+    <w:p>
+      <w:pPr>
+        <w:pStyle w:val="Heading2"/>
+      </w:pPr>
+      <w:r>
+        <w:t>12.9 Product Stewardship</w:t>
+      </w:r>
+    </w:p>
+    <w:p>
+      <w:pPr>
+        <w:spacing w:after="120"/>
+      </w:pPr>
+      <w:r>
+        <w:t>Purpose: participate in the lifecycle workflow. What the user can see: Sees stewardship acknowledgement work where assigned. What the user can do: Complete the assigned acknowledgement/task. Typical workflow: open assigned work, review instructions, complete permitted action, and return to the case. What happens after completion: Status is reflected in the lifecycle case.</w:t>
+      </w:r>
+    </w:p>
+    <w:p>
+      <w:pPr>
+        <w:pStyle w:val="Heading2"/>
+      </w:pPr>
+      <w:r>
+        <w:t>12.10 Onboarding Employee</w:t>
+      </w:r>
+    </w:p>
+    <w:p>
+      <w:pPr>
+        <w:spacing w:after="120"/>
+      </w:pPr>
+      <w:r>
+        <w:t>Purpose: participate in the lifecycle workflow. What the user can see: Sees personal onboarding views and assigned forms. What the user can do: Review and complete permitted forms and tasks. Typical workflow: open assigned work, review instructions, complete permitted action, and return to the case. What happens after completion: Completion appears in progress and activity history.</w:t>
+      </w:r>
+    </w:p>
+    <w:p>
+      <w:pPr>
+        <w:pStyle w:val="Heading2"/>
+      </w:pPr>
+      <w:r>
+        <w:t>12.11 Offboarding Employee</w:t>
+      </w:r>
+    </w:p>
+    <w:p>
+      <w:pPr>
+        <w:spacing w:after="120"/>
+      </w:pPr>
+      <w:r>
+        <w:t>Purpose: participate in the lifecycle workflow. What the user can see: Sees personal exit views and exit-clearance forms. What the user can do: Complete permitted exit information and forms. Typical workflow: open assigned work, review instructions, complete permitted action, and return to the case. What happens after completion: Completion becomes part of the exit case audit trail.</w:t>
+      </w:r>
+    </w:p>
+    <w:p>
+      <w:pPr>
+        <w:pStyle w:val="Heading1"/>
+      </w:pPr>
+      <w:r>
+        <w:t>13. Onboarding walkthrough — Aziz, Nabila</w:t>
+      </w:r>
+    </w:p>
+    <w:p>
+      <w:pPr>
+        <w:spacing w:after="120"/>
+      </w:pPr>
+      <w:r>
+        <w:t>Aziz, Nabila is the confirmed Preboarding demonstration employee. Prototype flow: PPG Workday Demo → Preboarding worker → OneFlow lifecycle case → role tasks created for HR, Hiring Manager, IT Security, Onsite IT, Facilities, Finance and other applicable roles → tasks completed → progress updated → mock notifications and activity history → onboarding ready. In Phase 1, case creation, task templates, updates and notifications are demonstrated locally. In production, approved Workday events and Power Automate would automate and monitor the hand-off.</w:t>
+      </w:r>
+    </w:p>
+    <w:p>
+      <w:pPr>
+        <w:pStyle w:val="Heading1"/>
+      </w:pPr>
+      <w:r>
+        <w:t>14. Offboarding walkthrough — Hamdan, Muhamad Asyraf Naqiyuddin</w:t>
+      </w:r>
+    </w:p>
+    <w:p>
+      <w:pPr>
+        <w:spacing w:after="120"/>
+      </w:pPr>
+      <w:r>
+        <w:t>Hamdan is the confirmed Offboarding demonstration employee. The prototype demonstrates offboarding initiation, departmental clearance, access removal, equipment return, finance and manager actions, outstanding items, completion, and the audit trail. These are local case and task behaviours in Phase 1; production automation would require approved Workday integration, identity/access integrations, and managed workflow services.</w:t>
+      </w:r>
+    </w:p>
     <w:p>
       <w:pPr>
         <w:pStyle w:val="Heading1"/>
@@ -1807,8 +2404,8 @@
       <w:r>
         <w:drawing>
           <wp:inline xmlns:a="http://schemas.openxmlformats.org/drawingml/2006/main" xmlns:pic="http://schemas.openxmlformats.org/drawingml/2006/picture">
-            <wp:extent cx="6080760" cy="1945843"/>
-            <wp:docPr id="1" name="Picture 1"/>
+            <wp:extent cx="6080760" cy="2026920"/>
+            <wp:docPr id="1" name="Picture 1" descr="Image: image1.png"/>
             <wp:cNvGraphicFramePr>
               <a:graphicFrameLocks noChangeAspect="1"/>
             </wp:cNvGraphicFramePr>
@@ -1828,7 +2425,7 @@
                   <pic:spPr>
                     <a:xfrm>
                       <a:off x="0" y="0"/>
-                      <a:ext cx="6080760" cy="1945843"/>
+                      <a:ext cx="6080760" cy="2026920"/>
                     </a:xfrm>
                     <a:prstGeom prst="rect"/>
                   </pic:spPr>
@@ -1849,7 +2446,15 @@
           <w:i/>
           <w:sz w:val="18"/>
         </w:rPr>
-        <w:t>Architecture diagram. Implemented prototype.</w:t>
+        <w:t>Diagram 1. Implemented prototype components.</w:t>
+      </w:r>
+    </w:p>
+    <w:p>
+      <w:pPr>
+        <w:spacing w:after="120"/>
+      </w:pPr>
+      <w:r>
+        <w:t>Next.js 15 and React 19 provide the UI. DataService and repository abstractions use browser local storage for the self-contained demo. A Dataverse repository placeholder exists but is not connected.</w:t>
       </w:r>
     </w:p>
     <w:p>
@@ -1864,8 +2469,8 @@
       <w:r>
         <w:drawing>
           <wp:inline xmlns:a="http://schemas.openxmlformats.org/drawingml/2006/main" xmlns:pic="http://schemas.openxmlformats.org/drawingml/2006/picture">
-            <wp:extent cx="6080760" cy="1945843"/>
-            <wp:docPr id="2" name="Picture 2"/>
+            <wp:extent cx="6080760" cy="2026920"/>
+            <wp:docPr id="2" name="Picture 2" descr="Image: image2.png"/>
             <wp:cNvGraphicFramePr>
               <a:graphicFrameLocks noChangeAspect="1"/>
             </wp:cNvGraphicFramePr>
@@ -1885,7 +2490,7 @@
                   <pic:spPr>
                     <a:xfrm>
                       <a:off x="0" y="0"/>
-                      <a:ext cx="6080760" cy="1945843"/>
+                      <a:ext cx="6080760" cy="2026920"/>
                     </a:xfrm>
                     <a:prstGeom prst="rect"/>
                   </pic:spPr>
@@ -1906,7 +2511,7 @@
           <w:i/>
           <w:sz w:val="18"/>
         </w:rPr>
-        <w:t>Architecture diagram. Implemented prototype.</w:t>
+        <w:t>Diagram 2. User-facing hackathon deployment path.</w:t>
       </w:r>
     </w:p>
     <w:p>
@@ -1914,7 +2519,7 @@
         <w:spacing w:after="120"/>
       </w:pPr>
       <w:r>
-        <w:t>Internet → Cloudflare DNS → HTTPS reverse proxy :443 → http://localhost:3005 → Docker host port 3005 → OneFlow container port 3000 → Next.js :3000.</w:t>
+        <w:t>Users access the OneFlow hackathon demo through https://oneflow.highrulez.com. The reverse proxy and Docker port mappings are internal deployment details and are not exposed to end users. Technical deployment note: Synology reverse proxy forwards internally to Docker host port 3005; Docker maps 3005:3000; the application listens on container port 3000.</w:t>
       </w:r>
     </w:p>
     <w:p>
@@ -1922,15 +2527,15 @@
         <w:pStyle w:val="Heading1"/>
       </w:pPr>
       <w:r>
-        <w:t>17. Future architecture — proposed</w:t>
+        <w:t>17. Proposed Microsoft-first production architecture</w:t>
       </w:r>
     </w:p>
     <w:p>
       <w:r>
         <w:drawing>
           <wp:inline xmlns:a="http://schemas.openxmlformats.org/drawingml/2006/main" xmlns:pic="http://schemas.openxmlformats.org/drawingml/2006/picture">
-            <wp:extent cx="6080760" cy="1945843"/>
-            <wp:docPr id="3" name="Picture 3"/>
+            <wp:extent cx="6080760" cy="2026920"/>
+            <wp:docPr id="3" name="Picture 3" descr="Image: image3.png"/>
             <wp:cNvGraphicFramePr>
               <a:graphicFrameLocks noChangeAspect="1"/>
             </wp:cNvGraphicFramePr>
@@ -1950,7 +2555,7 @@
                   <pic:spPr>
                     <a:xfrm>
                       <a:off x="0" y="0"/>
-                      <a:ext cx="6080760" cy="1945843"/>
+                      <a:ext cx="6080760" cy="2026920"/>
                     </a:xfrm>
                     <a:prstGeom prst="rect"/>
                   </pic:spPr>
@@ -1971,63 +2576,55 @@
           <w:i/>
           <w:sz w:val="18"/>
         </w:rPr>
-        <w:t>Architecture diagram. Proposed direction; not implemented.</w:t>
+        <w:t>Diagram 3. Proposed production architecture — not yet implemented.</w:t>
       </w:r>
     </w:p>
     <w:p>
       <w:pPr>
-        <w:pStyle w:val="Heading1"/>
+        <w:spacing w:after="120"/>
       </w:pPr>
       <w:r>
-        <w:t>18. Why Power Platform</w:t>
+        <w:t>The proposed production architecture follows a Microsoft-first approach because the organisation already primarily uses Microsoft 365 and Azure services. Final platform selection remains subject to PPG enterprise architecture, cybersecurity and licensing review. Workday integration/API events feed Microsoft Dataverse; Power Automate orchestrates approved workflows; OneFlow provides the experience layer; Microsoft 365 Outlook/Teams and Microsoft Graph support notifications; Power BI provides reporting; Microsoft Entra ID provides identity. Azure integration/API services, Azure Key Vault, Azure Monitor and Application Insights support secure, observable integration where required.</w:t>
       </w:r>
     </w:p>
     <w:p>
       <w:pPr>
-        <w:spacing w:after="120"/>
+        <w:pStyle w:val="Heading1"/>
       </w:pPr>
       <w:r>
-        <w:t>Power Platform is a suitable proposed direction because it combines governed workflow automation, Dataverse data modelling, Microsoft 365 integration, reporting, and enterprise identity. Licensing, connectors, data residency, and architecture still require review.</w:t>
+        <w:t>18. Production email and notification direction</w:t>
       </w:r>
     </w:p>
     <w:p>
       <w:pPr>
-        <w:pStyle w:val="Heading1"/>
+        <w:spacing w:after="120"/>
       </w:pPr>
       <w:r>
-        <w:t>19. Prototype cost</w:t>
+        <w:t>Production notifications should use Microsoft 365, Outlook, Exchange Online, Microsoft Graph, and/or the Power Automate Microsoft 365 Outlook connector as appropriate. This uses the organisation’s existing communication ecosystem. The optional AWS SES prototype/legacy capability is NOT part of the recommended production architecture.</w:t>
       </w:r>
     </w:p>
     <w:p>
       <w:pPr>
-        <w:spacing w:after="120"/>
+        <w:pStyle w:val="Heading1"/>
       </w:pPr>
       <w:r>
-        <w:t>Incremental software licensing for the prototype is RM0 where existing Synology/Docker infrastructure and open-source dependencies are used. Developer effort, domain/DNS services, support, and optional email are real costs but are not valued here.</w:t>
+        <w:t>19. Production cost assumptions</w:t>
       </w:r>
     </w:p>
     <w:p>
       <w:pPr>
-        <w:pStyle w:val="Heading1"/>
+        <w:spacing w:after="120"/>
       </w:pPr>
       <w:r>
-        <w:t>20. Estimated production cost — planning only</w:t>
+        <w:t>Indicative planning estimate only. PPG may already have significant Microsoft 365, Outlook/Exchange Online, Entra ID, Azure tenant/services, and some Power Platform entitlement under an existing enterprise agreement; entitlement to be confirmed. Do not treat existing services as free. Actual PPG cost may be materially lower or structured differently due to existing Microsoft enterprise licensing agreements.</w:t>
       </w:r>
     </w:p>
     <w:p>
       <w:pPr>
-        <w:spacing w:after="120"/>
+        <w:pStyle w:val="Heading1"/>
       </w:pPr>
       <w:r>
-        <w:t>Public pricing checked 19 August 2026 using Microsoft Malaysia and AWS price pages. Values are indicative list-price planning figures, exclude taxes and discounts, and use USD 1 = RM4.25 as an illustrative planning conversion; obtain a quote before approval.</w:t>
-      </w:r>
-    </w:p>
-    <w:p>
-      <w:pPr>
-        <w:pStyle w:val="Heading2"/>
-      </w:pPr>
-      <w:r>
-        <w:t>20.1 Licensing scenarios</w:t>
+        <w:t>20. Incremental production costs</w:t>
       </w:r>
     </w:p>
     <w:tbl>
@@ -2038,14 +2635,14 @@
         <w:tblLook w:firstColumn="1" w:firstRow="1" w:lastColumn="0" w:lastRow="0" w:noHBand="0" w:noVBand="1" w:val="04A0"/>
       </w:tblPr>
       <w:tblGrid>
-        <w:gridCol w:w="3312"/>
-        <w:gridCol w:w="3312"/>
-        <w:gridCol w:w="3312"/>
+        <w:gridCol w:w="3331"/>
+        <w:gridCol w:w="3331"/>
+        <w:gridCol w:w="3331"/>
       </w:tblGrid>
       <w:tr>
         <w:tc>
           <w:tcPr>
-            <w:tcW w:type="dxa" w:w="3312"/>
+            <w:tcW w:type="dxa" w:w="3331"/>
             <w:shd w:fill="0B3A70"/>
           </w:tcPr>
           <w:p>
@@ -2054,13 +2651,13 @@
                 <w:b/>
                 <w:color w:val="FFFFFF"/>
               </w:rPr>
-              <w:t>Scenario</w:t>
+              <w:t>Incremental component</w:t>
             </w:r>
           </w:p>
         </w:tc>
         <w:tc>
           <w:tcPr>
-            <w:tcW w:type="dxa" w:w="3312"/>
+            <w:tcW w:type="dxa" w:w="3331"/>
             <w:shd w:fill="0B3A70"/>
           </w:tcPr>
           <w:p>
@@ -2069,13 +2666,13 @@
                 <w:b/>
                 <w:color w:val="FFFFFF"/>
               </w:rPr>
-              <w:t>Indicative monthly list cost</w:t>
+              <w:t>Public planning indicator</w:t>
             </w:r>
           </w:p>
         </w:tc>
         <w:tc>
           <w:tcPr>
-            <w:tcW w:type="dxa" w:w="3312"/>
+            <w:tcW w:type="dxa" w:w="3331"/>
             <w:shd w:fill="0B3A70"/>
           </w:tcPr>
           <w:p>
@@ -2084,7 +2681,42 @@
                 <w:b/>
                 <w:color w:val="FFFFFF"/>
               </w:rPr>
-              <w:t>Assumptions</w:t>
+              <w:t>Planning note</w:t>
+            </w:r>
+          </w:p>
+        </w:tc>
+        <w:trPr>
+          <w:tblHeader/>
+        </w:trPr>
+      </w:tr>
+      <w:tr>
+        <w:tc>
+          <w:tcPr>
+            <w:tcW w:type="dxa" w:w="3331"/>
+          </w:tcPr>
+          <w:p>
+            <w:r>
+              <w:t>Power Apps Premium</w:t>
+            </w:r>
+          </w:p>
+        </w:tc>
+        <w:tc>
+          <w:tcPr>
+            <w:tcW w:type="dxa" w:w="3331"/>
+          </w:tcPr>
+          <w:p>
+            <w:r>
+              <w:t>USD20/user/month ≈ RM85</w:t>
+            </w:r>
+          </w:p>
+        </w:tc>
+        <w:tc>
+          <w:tcPr>
+            <w:tcW w:type="dxa" w:w="3331"/>
+          </w:tcPr>
+          <w:p>
+            <w:r>
+              <w:t>Where required; entitlement to be confirmed</w:t>
             </w:r>
           </w:p>
         </w:tc>
@@ -2092,31 +2724,31 @@
       <w:tr>
         <w:tc>
           <w:tcPr>
-            <w:tcW w:type="dxa" w:w="3312"/>
+            <w:tcW w:type="dxa" w:w="3331"/>
           </w:tcPr>
           <w:p>
             <w:r>
-              <w:t>Pilot</w:t>
+              <w:t>Power Automate Premium</w:t>
             </w:r>
           </w:p>
         </w:tc>
         <w:tc>
           <w:tcPr>
-            <w:tcW w:type="dxa" w:w="3312"/>
+            <w:tcW w:type="dxa" w:w="3331"/>
           </w:tcPr>
           <w:p>
             <w:r>
-              <w:t>RM4,485</w:t>
+              <w:t>USD15/user/month ≈ RM63.75</w:t>
             </w:r>
           </w:p>
         </w:tc>
         <w:tc>
           <w:tcPr>
-            <w:tcW w:type="dxa" w:w="3312"/>
+            <w:tcW w:type="dxa" w:w="3331"/>
           </w:tcPr>
           <w:p>
             <w:r>
-              <w:t>25 Power Apps + Power Automate; 10 Power BI Pro; 1 GB Dataverse</w:t>
+              <w:t>Premium users/connectors where required</w:t>
             </w:r>
           </w:p>
         </w:tc>
@@ -2124,31 +2756,31 @@
       <w:tr>
         <w:tc>
           <w:tcPr>
-            <w:tcW w:type="dxa" w:w="3312"/>
+            <w:tcW w:type="dxa" w:w="3331"/>
           </w:tcPr>
           <w:p>
             <w:r>
-              <w:t>Malaysia production</w:t>
+              <w:t>Power Automate Process</w:t>
             </w:r>
           </w:p>
         </w:tc>
         <w:tc>
           <w:tcPr>
-            <w:tcW w:type="dxa" w:w="3312"/>
+            <w:tcW w:type="dxa" w:w="3331"/>
           </w:tcPr>
           <w:p>
             <w:r>
-              <w:t>RM17,315</w:t>
+              <w:t>USD150/bot/month ≈ RM637.50</w:t>
             </w:r>
           </w:p>
         </w:tc>
         <w:tc>
           <w:tcPr>
-            <w:tcW w:type="dxa" w:w="3312"/>
+            <w:tcW w:type="dxa" w:w="3331"/>
           </w:tcPr>
           <w:p>
             <w:r>
-              <w:t>100 Power Apps + Power Automate; 30 Power BI Pro; 2 GB Dataverse</w:t>
+              <w:t>Only for applicable unattended/process automation</w:t>
             </w:r>
           </w:p>
         </w:tc>
@@ -2156,31 +2788,127 @@
       <w:tr>
         <w:tc>
           <w:tcPr>
-            <w:tcW w:type="dxa" w:w="3312"/>
+            <w:tcW w:type="dxa" w:w="3331"/>
           </w:tcPr>
           <w:p>
             <w:r>
-              <w:t>Regional enterprise</w:t>
+              <w:t>Dataverse database capacity</w:t>
             </w:r>
           </w:p>
         </w:tc>
         <w:tc>
           <w:tcPr>
-            <w:tcW w:type="dxa" w:w="3312"/>
+            <w:tcW w:type="dxa" w:w="3331"/>
           </w:tcPr>
           <w:p>
             <w:r>
-              <w:t>Quote required</w:t>
+              <w:t>USD40/GB/month ≈ RM170</w:t>
             </w:r>
           </w:p>
         </w:tc>
         <w:tc>
           <w:tcPr>
-            <w:tcW w:type="dxa" w:w="3312"/>
+            <w:tcW w:type="dxa" w:w="3331"/>
           </w:tcPr>
           <w:p>
             <w:r>
-              <w:t>Agreement, usage, connectors, capacity and support</w:t>
+              <w:t>Only for incremental pooled capacity</w:t>
+            </w:r>
+          </w:p>
+        </w:tc>
+      </w:tr>
+      <w:tr>
+        <w:tc>
+          <w:tcPr>
+            <w:tcW w:type="dxa" w:w="3331"/>
+          </w:tcPr>
+          <w:p>
+            <w:r>
+              <w:t>Power BI Pro</w:t>
+            </w:r>
+          </w:p>
+        </w:tc>
+        <w:tc>
+          <w:tcPr>
+            <w:tcW w:type="dxa" w:w="3331"/>
+          </w:tcPr>
+          <w:p>
+            <w:r>
+              <w:t>USD14/user/month ≈ RM59.50</w:t>
+            </w:r>
+          </w:p>
+        </w:tc>
+        <w:tc>
+          <w:tcPr>
+            <w:tcW w:type="dxa" w:w="3331"/>
+          </w:tcPr>
+          <w:p>
+            <w:r>
+              <w:t>May be included in existing licensing</w:t>
+            </w:r>
+          </w:p>
+        </w:tc>
+      </w:tr>
+      <w:tr>
+        <w:tc>
+          <w:tcPr>
+            <w:tcW w:type="dxa" w:w="3331"/>
+          </w:tcPr>
+          <w:p>
+            <w:r>
+              <w:t>Azure integration, Key Vault, Monitor, App Insights</w:t>
+            </w:r>
+          </w:p>
+        </w:tc>
+        <w:tc>
+          <w:tcPr>
+            <w:tcW w:type="dxa" w:w="3331"/>
+          </w:tcPr>
+          <w:p>
+            <w:r>
+              <w:t>Consumption / quote required</w:t>
+            </w:r>
+          </w:p>
+        </w:tc>
+        <w:tc>
+          <w:tcPr>
+            <w:tcW w:type="dxa" w:w="3331"/>
+          </w:tcPr>
+          <w:p>
+            <w:r>
+              <w:t>Usage, region, retention and enterprise agreement dependent</w:t>
+            </w:r>
+          </w:p>
+        </w:tc>
+      </w:tr>
+      <w:tr>
+        <w:tc>
+          <w:tcPr>
+            <w:tcW w:type="dxa" w:w="3331"/>
+          </w:tcPr>
+          <w:p>
+            <w:r>
+              <w:t>Workday integration/API access</w:t>
+            </w:r>
+          </w:p>
+        </w:tc>
+        <w:tc>
+          <w:tcPr>
+            <w:tcW w:type="dxa" w:w="3331"/>
+          </w:tcPr>
+          <w:p>
+            <w:r>
+              <w:t>Quote / internal confirmation required</w:t>
+            </w:r>
+          </w:p>
+        </w:tc>
+        <w:tc>
+          <w:tcPr>
+            <w:tcW w:type="dxa" w:w="3331"/>
+          </w:tcPr>
+          <w:p>
+            <w:r>
+              <w:t>Contract and interface scope dependent</w:t>
             </w:r>
           </w:p>
         </w:tc>
@@ -2189,26 +2917,66 @@
     <w:p/>
     <w:p>
       <w:pPr>
-        <w:pStyle w:val="Heading2"/>
+        <w:spacing w:after="120"/>
       </w:pPr>
       <w:r>
-        <w:t>20.2 One-time implementation</w:t>
+        <w:t>Prices are public marketing/list-price indicators checked 19 August 2026, exclude tax and discounts, and use USD1 = RM4.25 for illustrative planning conversion. Do not use as a procurement quote.</w:t>
       </w:r>
     </w:p>
     <w:p>
       <w:pPr>
-        <w:spacing w:after="120"/>
+        <w:pStyle w:val="Heading1"/>
       </w:pPr>
       <w:r>
-        <w:t>Indicative discovery-to-rollout range: RM260,000–RM750,000 for approved integrations, data model, SSO/security, workflow configuration, testing, reporting, training, change management, and support transition. This is not a vendor quote.</w:t>
+        <w:t>21. Implementation and ongoing cost</w:t>
       </w:r>
     </w:p>
     <w:p>
       <w:pPr>
-        <w:pStyle w:val="Heading2"/>
+        <w:spacing w:after="120"/>
       </w:pPr>
       <w:r>
-        <w:t>20.3 Recurring components</w:t>
+        <w:t>Indicative planning estimate: RM260,000–RM750,000 for discovery, integration, data model, SSO/security, workflow configuration, testing, reporting, training, change management, and support transition. Ongoing cost depends on incremental licences, Azure consumption, Workday interfaces, support, maintenance, assessment, and testing. Avoid false precision; obtain enterprise and vendor quotes.</w:t>
+      </w:r>
+    </w:p>
+    <w:p>
+      <w:pPr>
+        <w:pStyle w:val="Heading1"/>
+      </w:pPr>
+      <w:r>
+        <w:t>22. ROI framework</w:t>
+      </w:r>
+    </w:p>
+    <w:p>
+      <w:pPr>
+        <w:spacing w:after="120"/>
+      </w:pPr>
+      <w:r>
+        <w:t>Measure saved handling time, avoided rework, late provisioning, onboarding readiness, offboarding closure, audit evidence, and stakeholder satisfaction. Formula: (annual quantified benefit − annual recurring cost) ÷ implementation cost. Do not assume salary figures without validated HR inputs.</w:t>
+      </w:r>
+    </w:p>
+    <w:p>
+      <w:pPr>
+        <w:pStyle w:val="Heading1"/>
+      </w:pPr>
+      <w:r>
+        <w:t>23. Security and privacy</w:t>
+      </w:r>
+    </w:p>
+    <w:p>
+      <w:pPr>
+        <w:spacing w:after="120"/>
+      </w:pPr>
+      <w:r>
+        <w:t>The demo uses synthetic data. Production requires Entra ID SSO/MFA/RBAC, least privilege, Key Vault secrets, encryption, audit retention, secure SDLC, approved integration identities, data minimisation, retention/deletion controls, and required security/privacy assessments.</w:t>
+      </w:r>
+    </w:p>
+    <w:p>
+      <w:pPr>
+        <w:pStyle w:val="Heading1"/>
+      </w:pPr>
+      <w:r>
+        <w:t>24. Limitations and readiness gap</w:t>
       </w:r>
     </w:p>
     <w:tbl>
@@ -2219,355 +2987,14 @@
         <w:tblLook w:firstColumn="1" w:firstRow="1" w:lastColumn="0" w:lastRow="0" w:noHBand="0" w:noVBand="1" w:val="04A0"/>
       </w:tblPr>
       <w:tblGrid>
-        <w:gridCol w:w="3312"/>
-        <w:gridCol w:w="3312"/>
-        <w:gridCol w:w="3312"/>
+        <w:gridCol w:w="3331"/>
+        <w:gridCol w:w="3331"/>
+        <w:gridCol w:w="3331"/>
       </w:tblGrid>
       <w:tr>
         <w:tc>
           <w:tcPr>
-            <w:tcW w:type="dxa" w:w="3312"/>
-            <w:shd w:fill="0B3A70"/>
-          </w:tcPr>
-          <w:p>
-            <w:r>
-              <w:rPr>
-                <w:b/>
-                <w:color w:val="FFFFFF"/>
-              </w:rPr>
-              <w:t>Component</w:t>
-            </w:r>
-          </w:p>
-        </w:tc>
-        <w:tc>
-          <w:tcPr>
-            <w:tcW w:type="dxa" w:w="3312"/>
-            <w:shd w:fill="0B3A70"/>
-          </w:tcPr>
-          <w:p>
-            <w:r>
-              <w:rPr>
-                <w:b/>
-                <w:color w:val="FFFFFF"/>
-              </w:rPr>
-              <w:t>Public list price</w:t>
-            </w:r>
-          </w:p>
-        </w:tc>
-        <w:tc>
-          <w:tcPr>
-            <w:tcW w:type="dxa" w:w="3312"/>
-            <w:shd w:fill="0B3A70"/>
-          </w:tcPr>
-          <w:p>
-            <w:r>
-              <w:rPr>
-                <w:b/>
-                <w:color w:val="FFFFFF"/>
-              </w:rPr>
-              <w:t>Planning MYR</w:t>
-            </w:r>
-          </w:p>
-        </w:tc>
-      </w:tr>
-      <w:tr>
-        <w:tc>
-          <w:tcPr>
-            <w:tcW w:type="dxa" w:w="3312"/>
-          </w:tcPr>
-          <w:p>
-            <w:r>
-              <w:t>Power Apps Premium</w:t>
-            </w:r>
-          </w:p>
-        </w:tc>
-        <w:tc>
-          <w:tcPr>
-            <w:tcW w:type="dxa" w:w="3312"/>
-          </w:tcPr>
-          <w:p>
-            <w:r>
-              <w:t>USD20/user/month</w:t>
-            </w:r>
-          </w:p>
-        </w:tc>
-        <w:tc>
-          <w:tcPr>
-            <w:tcW w:type="dxa" w:w="3312"/>
-          </w:tcPr>
-          <w:p>
-            <w:r>
-              <w:t>RM85/user/month</w:t>
-            </w:r>
-          </w:p>
-        </w:tc>
-      </w:tr>
-      <w:tr>
-        <w:tc>
-          <w:tcPr>
-            <w:tcW w:type="dxa" w:w="3312"/>
-          </w:tcPr>
-          <w:p>
-            <w:r>
-              <w:t>Power Automate Premium</w:t>
-            </w:r>
-          </w:p>
-        </w:tc>
-        <w:tc>
-          <w:tcPr>
-            <w:tcW w:type="dxa" w:w="3312"/>
-          </w:tcPr>
-          <w:p>
-            <w:r>
-              <w:t>USD15/user/month</w:t>
-            </w:r>
-          </w:p>
-        </w:tc>
-        <w:tc>
-          <w:tcPr>
-            <w:tcW w:type="dxa" w:w="3312"/>
-          </w:tcPr>
-          <w:p>
-            <w:r>
-              <w:t>RM63.75/user/month</w:t>
-            </w:r>
-          </w:p>
-        </w:tc>
-      </w:tr>
-      <w:tr>
-        <w:tc>
-          <w:tcPr>
-            <w:tcW w:type="dxa" w:w="3312"/>
-          </w:tcPr>
-          <w:p>
-            <w:r>
-              <w:t>Power BI Pro</w:t>
-            </w:r>
-          </w:p>
-        </w:tc>
-        <w:tc>
-          <w:tcPr>
-            <w:tcW w:type="dxa" w:w="3312"/>
-          </w:tcPr>
-          <w:p>
-            <w:r>
-              <w:t>USD14/user/month</w:t>
-            </w:r>
-          </w:p>
-        </w:tc>
-        <w:tc>
-          <w:tcPr>
-            <w:tcW w:type="dxa" w:w="3312"/>
-          </w:tcPr>
-          <w:p>
-            <w:r>
-              <w:t>RM59.50/user/month</w:t>
-            </w:r>
-          </w:p>
-        </w:tc>
-      </w:tr>
-      <w:tr>
-        <w:tc>
-          <w:tcPr>
-            <w:tcW w:type="dxa" w:w="3312"/>
-          </w:tcPr>
-          <w:p>
-            <w:r>
-              <w:t>Dataverse DB add-on</w:t>
-            </w:r>
-          </w:p>
-        </w:tc>
-        <w:tc>
-          <w:tcPr>
-            <w:tcW w:type="dxa" w:w="3312"/>
-          </w:tcPr>
-          <w:p>
-            <w:r>
-              <w:t>USD40/GB/month</w:t>
-            </w:r>
-          </w:p>
-        </w:tc>
-        <w:tc>
-          <w:tcPr>
-            <w:tcW w:type="dxa" w:w="3312"/>
-          </w:tcPr>
-          <w:p>
-            <w:r>
-              <w:t>RM170/GB/month</w:t>
-            </w:r>
-          </w:p>
-        </w:tc>
-      </w:tr>
-      <w:tr>
-        <w:tc>
-          <w:tcPr>
-            <w:tcW w:type="dxa" w:w="3312"/>
-          </w:tcPr>
-          <w:p>
-            <w:r>
-              <w:t>Power Automate Process</w:t>
-            </w:r>
-          </w:p>
-        </w:tc>
-        <w:tc>
-          <w:tcPr>
-            <w:tcW w:type="dxa" w:w="3312"/>
-          </w:tcPr>
-          <w:p>
-            <w:r>
-              <w:t>USD150/bot/month</w:t>
-            </w:r>
-          </w:p>
-        </w:tc>
-        <w:tc>
-          <w:tcPr>
-            <w:tcW w:type="dxa" w:w="3312"/>
-          </w:tcPr>
-          <w:p>
-            <w:r>
-              <w:t>RM637.50/bot/month</w:t>
-            </w:r>
-          </w:p>
-        </w:tc>
-      </w:tr>
-      <w:tr>
-        <w:tc>
-          <w:tcPr>
-            <w:tcW w:type="dxa" w:w="3312"/>
-          </w:tcPr>
-          <w:p>
-            <w:r>
-              <w:t>AWS SES Essentials</w:t>
-            </w:r>
-          </w:p>
-        </w:tc>
-        <w:tc>
-          <w:tcPr>
-            <w:tcW w:type="dxa" w:w="3312"/>
-          </w:tcPr>
-          <w:p>
-            <w:r>
-              <w:t>USD0.16/1,000 emails</w:t>
-            </w:r>
-          </w:p>
-        </w:tc>
-        <w:tc>
-          <w:tcPr>
-            <w:tcW w:type="dxa" w:w="3312"/>
-          </w:tcPr>
-          <w:p>
-            <w:r>
-              <w:t>RM0.68/1,000 emails</w:t>
-            </w:r>
-          </w:p>
-        </w:tc>
-      </w:tr>
-    </w:tbl>
-    <w:p/>
-    <w:p>
-      <w:pPr>
-        <w:pStyle w:val="Heading2"/>
-      </w:pPr>
-      <w:r>
-        <w:t>20.4 Executive cost view</w:t>
-      </w:r>
-    </w:p>
-    <w:p>
-      <w:pPr>
-        <w:spacing w:after="120"/>
-      </w:pPr>
-      <w:r>
-        <w:t>The pilot is a controlled baseline, not a procurement recommendation. Validate eligible bundled Microsoft entitlements, tax, discounts, capacity, and delivery scope with Microsoft and implementation partners.</w:t>
-      </w:r>
-    </w:p>
-    <w:p>
-      <w:pPr>
-        <w:pStyle w:val="Heading1"/>
-      </w:pPr>
-      <w:r>
-        <w:t>21. ROI framework</w:t>
-      </w:r>
-    </w:p>
-    <w:p>
-      <w:pPr>
-        <w:spacing w:after="120"/>
-      </w:pPr>
-      <w:r>
-        <w:t>Measure saved handling time, avoided rework, late provisioning, onboarding readiness, exit-risk closure, audit evidence, and stakeholder satisfaction. Formula: (annual quantified benefit − annual recurring cost) ÷ implementation cost. Do not use salary figures without validated HR inputs.</w:t>
-      </w:r>
-    </w:p>
-    <w:p>
-      <w:pPr>
-        <w:pStyle w:val="Heading1"/>
-      </w:pPr>
-      <w:r>
-        <w:t>22. Security considerations</w:t>
-      </w:r>
-    </w:p>
-    <w:p>
-      <w:pPr>
-        <w:spacing w:after="120"/>
-      </w:pPr>
-      <w:r>
-        <w:t>Current controls are demo-oriented. Production requires Entra ID SSO, least privilege, secrets management, encryption, audit retention, vulnerability management, secure SDLC, and approved integration identities.</w:t>
-      </w:r>
-    </w:p>
-    <w:p>
-      <w:pPr>
-        <w:pStyle w:val="Heading1"/>
-      </w:pPr>
-      <w:r>
-        <w:t>23. Privacy and data handling</w:t>
-      </w:r>
-    </w:p>
-    <w:p>
-      <w:pPr>
-        <w:spacing w:after="120"/>
-      </w:pPr>
-      <w:r>
-        <w:t>Use synthetic demo data only. Production must minimise personal data, define retention/deletion, assess transfers, use access logging, and complete required privacy and security assessments.</w:t>
-      </w:r>
-    </w:p>
-    <w:p>
-      <w:pPr>
-        <w:pStyle w:val="Heading1"/>
-      </w:pPr>
-      <w:r>
-        <w:t>24. Limitations</w:t>
-      </w:r>
-    </w:p>
-    <w:p>
-      <w:pPr>
-        <w:spacing w:after="120"/>
-      </w:pPr>
-      <w:r>
-        <w:t>No live Workday, Dataverse, Power Automate, Entra ID, Power BI, or production-grade email delivery is implemented. Mock inbox and optional SES configuration are for demonstration only.</w:t>
-      </w:r>
-    </w:p>
-    <w:p>
-      <w:pPr>
-        <w:pStyle w:val="Heading1"/>
-      </w:pPr>
-      <w:r>
-        <w:t>25. Production readiness gap</w:t>
-      </w:r>
-    </w:p>
-    <w:tbl>
-      <w:tblPr>
-        <w:tblStyle w:val="TableGrid"/>
-        <w:tblW w:type="auto" w:w="0"/>
-        <w:jc w:val="center"/>
-        <w:tblLook w:firstColumn="1" w:firstRow="1" w:lastColumn="0" w:lastRow="0" w:noHBand="0" w:noVBand="1" w:val="04A0"/>
-      </w:tblPr>
-      <w:tblGrid>
-        <w:gridCol w:w="3312"/>
-        <w:gridCol w:w="3312"/>
-        <w:gridCol w:w="3312"/>
-      </w:tblGrid>
-      <w:tr>
-        <w:tc>
-          <w:tcPr>
-            <w:tcW w:type="dxa" w:w="3312"/>
+            <w:tcW w:type="dxa" w:w="3331"/>
             <w:shd w:fill="0B3A70"/>
           </w:tcPr>
           <w:p>
@@ -2582,7 +3009,7 @@
         </w:tc>
         <w:tc>
           <w:tcPr>
-            <w:tcW w:type="dxa" w:w="3312"/>
+            <w:tcW w:type="dxa" w:w="3331"/>
             <w:shd w:fill="0B3A70"/>
           </w:tcPr>
           <w:p>
@@ -2597,7 +3024,7 @@
         </w:tc>
         <w:tc>
           <w:tcPr>
-            <w:tcW w:type="dxa" w:w="3312"/>
+            <w:tcW w:type="dxa" w:w="3331"/>
             <w:shd w:fill="0B3A70"/>
           </w:tcPr>
           <w:p>
@@ -2610,11 +3037,14 @@
             </w:r>
           </w:p>
         </w:tc>
+        <w:trPr>
+          <w:tblHeader/>
+        </w:trPr>
       </w:tr>
       <w:tr>
         <w:tc>
           <w:tcPr>
-            <w:tcW w:type="dxa" w:w="3312"/>
+            <w:tcW w:type="dxa" w:w="3331"/>
           </w:tcPr>
           <w:p>
             <w:r>
@@ -2624,7 +3054,7 @@
         </w:tc>
         <w:tc>
           <w:tcPr>
-            <w:tcW w:type="dxa" w:w="3312"/>
+            <w:tcW w:type="dxa" w:w="3331"/>
           </w:tcPr>
           <w:p>
             <w:r>
@@ -2634,7 +3064,7 @@
         </w:tc>
         <w:tc>
           <w:tcPr>
-            <w:tcW w:type="dxa" w:w="3312"/>
+            <w:tcW w:type="dxa" w:w="3331"/>
           </w:tcPr>
           <w:p>
             <w:r>
@@ -2646,7 +3076,7 @@
       <w:tr>
         <w:tc>
           <w:tcPr>
-            <w:tcW w:type="dxa" w:w="3312"/>
+            <w:tcW w:type="dxa" w:w="3331"/>
           </w:tcPr>
           <w:p>
             <w:r>
@@ -2656,7 +3086,7 @@
         </w:tc>
         <w:tc>
           <w:tcPr>
-            <w:tcW w:type="dxa" w:w="3312"/>
+            <w:tcW w:type="dxa" w:w="3331"/>
           </w:tcPr>
           <w:p>
             <w:r>
@@ -2666,7 +3096,7 @@
         </w:tc>
         <w:tc>
           <w:tcPr>
-            <w:tcW w:type="dxa" w:w="3312"/>
+            <w:tcW w:type="dxa" w:w="3331"/>
           </w:tcPr>
           <w:p>
             <w:r>
@@ -2678,7 +3108,7 @@
       <w:tr>
         <w:tc>
           <w:tcPr>
-            <w:tcW w:type="dxa" w:w="3312"/>
+            <w:tcW w:type="dxa" w:w="3331"/>
           </w:tcPr>
           <w:p>
             <w:r>
@@ -2688,7 +3118,7 @@
         </w:tc>
         <w:tc>
           <w:tcPr>
-            <w:tcW w:type="dxa" w:w="3312"/>
+            <w:tcW w:type="dxa" w:w="3331"/>
           </w:tcPr>
           <w:p>
             <w:r>
@@ -2698,11 +3128,11 @@
         </w:tc>
         <w:tc>
           <w:tcPr>
-            <w:tcW w:type="dxa" w:w="3312"/>
+            <w:tcW w:type="dxa" w:w="3331"/>
           </w:tcPr>
           <w:p>
             <w:r>
-              <w:t>APIs, retries, monitoring</w:t>
+              <w:t>Approved APIs, retries, monitoring</w:t>
             </w:r>
           </w:p>
         </w:tc>
@@ -2710,7 +3140,7 @@
       <w:tr>
         <w:tc>
           <w:tcPr>
-            <w:tcW w:type="dxa" w:w="3312"/>
+            <w:tcW w:type="dxa" w:w="3331"/>
           </w:tcPr>
           <w:p>
             <w:r>
@@ -2720,21 +3150,21 @@
         </w:tc>
         <w:tc>
           <w:tcPr>
-            <w:tcW w:type="dxa" w:w="3312"/>
+            <w:tcW w:type="dxa" w:w="3331"/>
           </w:tcPr>
           <w:p>
             <w:r>
-              <w:t>Simulated</w:t>
+              <w:t>Simulation</w:t>
             </w:r>
           </w:p>
         </w:tc>
         <w:tc>
           <w:tcPr>
-            <w:tcW w:type="dxa" w:w="3312"/>
+            <w:tcW w:type="dxa" w:w="3331"/>
           </w:tcPr>
           <w:p>
             <w:r>
-              <w:t>Power Automate</w:t>
+              <w:t>Power Automate/managed workflows</w:t>
             </w:r>
           </w:p>
         </w:tc>
@@ -2742,7 +3172,71 @@
       <w:tr>
         <w:tc>
           <w:tcPr>
-            <w:tcW w:type="dxa" w:w="3312"/>
+            <w:tcW w:type="dxa" w:w="3331"/>
+          </w:tcPr>
+          <w:p>
+            <w:r>
+              <w:t>Notifications</w:t>
+            </w:r>
+          </w:p>
+        </w:tc>
+        <w:tc>
+          <w:tcPr>
+            <w:tcW w:type="dxa" w:w="3331"/>
+          </w:tcPr>
+          <w:p>
+            <w:r>
+              <w:t>Mock inbox</w:t>
+            </w:r>
+          </w:p>
+        </w:tc>
+        <w:tc>
+          <w:tcPr>
+            <w:tcW w:type="dxa" w:w="3331"/>
+          </w:tcPr>
+          <w:p>
+            <w:r>
+              <w:t>Microsoft 365/Graph/Outlook</w:t>
+            </w:r>
+          </w:p>
+        </w:tc>
+      </w:tr>
+      <w:tr>
+        <w:tc>
+          <w:tcPr>
+            <w:tcW w:type="dxa" w:w="3331"/>
+          </w:tcPr>
+          <w:p>
+            <w:r>
+              <w:t>Observability</w:t>
+            </w:r>
+          </w:p>
+        </w:tc>
+        <w:tc>
+          <w:tcPr>
+            <w:tcW w:type="dxa" w:w="3331"/>
+          </w:tcPr>
+          <w:p>
+            <w:r>
+              <w:t>Manual demo support</w:t>
+            </w:r>
+          </w:p>
+        </w:tc>
+        <w:tc>
+          <w:tcPr>
+            <w:tcW w:type="dxa" w:w="3331"/>
+          </w:tcPr>
+          <w:p>
+            <w:r>
+              <w:t>Azure Monitor/App Insights</w:t>
+            </w:r>
+          </w:p>
+        </w:tc>
+      </w:tr>
+      <w:tr>
+        <w:tc>
+          <w:tcPr>
+            <w:tcW w:type="dxa" w:w="3331"/>
           </w:tcPr>
           <w:p>
             <w:r>
@@ -2752,7 +3246,7 @@
         </w:tc>
         <w:tc>
           <w:tcPr>
-            <w:tcW w:type="dxa" w:w="3312"/>
+            <w:tcW w:type="dxa" w:w="3331"/>
           </w:tcPr>
           <w:p>
             <w:r>
@@ -2762,7 +3256,7 @@
         </w:tc>
         <w:tc>
           <w:tcPr>
-            <w:tcW w:type="dxa" w:w="3312"/>
+            <w:tcW w:type="dxa" w:w="3331"/>
           </w:tcPr>
           <w:p>
             <w:r>
@@ -2771,38 +3265,6 @@
           </w:p>
         </w:tc>
       </w:tr>
-      <w:tr>
-        <w:tc>
-          <w:tcPr>
-            <w:tcW w:type="dxa" w:w="3312"/>
-          </w:tcPr>
-          <w:p>
-            <w:r>
-              <w:t>Operations</w:t>
-            </w:r>
-          </w:p>
-        </w:tc>
-        <w:tc>
-          <w:tcPr>
-            <w:tcW w:type="dxa" w:w="3312"/>
-          </w:tcPr>
-          <w:p>
-            <w:r>
-              <w:t>Manual support</w:t>
-            </w:r>
-          </w:p>
-        </w:tc>
-        <w:tc>
-          <w:tcPr>
-            <w:tcW w:type="dxa" w:w="3312"/>
-          </w:tcPr>
-          <w:p>
-            <w:r>
-              <w:t>Monitoring, backup, change process</w:t>
-            </w:r>
-          </w:p>
-        </w:tc>
-      </w:tr>
     </w:tbl>
     <w:p/>
     <w:p>
@@ -2810,7 +3272,7 @@
         <w:pStyle w:val="Heading1"/>
       </w:pPr>
       <w:r>
-        <w:t>26. Roadmap</w:t>
+        <w:t>25. Roadmap</w:t>
       </w:r>
     </w:p>
     <w:tbl>
@@ -2821,13 +3283,13 @@
         <w:tblLook w:firstColumn="1" w:firstRow="1" w:lastColumn="0" w:lastRow="0" w:noHBand="0" w:noVBand="1" w:val="04A0"/>
       </w:tblPr>
       <w:tblGrid>
-        <w:gridCol w:w="4968"/>
-        <w:gridCol w:w="4968"/>
+        <w:gridCol w:w="4997"/>
+        <w:gridCol w:w="4997"/>
       </w:tblGrid>
       <w:tr>
         <w:tc>
           <w:tcPr>
-            <w:tcW w:type="dxa" w:w="4968"/>
+            <w:tcW w:type="dxa" w:w="4997"/>
             <w:shd w:fill="0B3A70"/>
           </w:tcPr>
           <w:p>
@@ -2842,7 +3304,7 @@
         </w:tc>
         <w:tc>
           <w:tcPr>
-            <w:tcW w:type="dxa" w:w="4968"/>
+            <w:tcW w:type="dxa" w:w="4997"/>
             <w:shd w:fill="0B3A70"/>
           </w:tcPr>
           <w:p>
@@ -2855,11 +3317,14 @@
             </w:r>
           </w:p>
         </w:tc>
+        <w:trPr>
+          <w:tblHeader/>
+        </w:trPr>
       </w:tr>
       <w:tr>
         <w:tc>
           <w:tcPr>
-            <w:tcW w:type="dxa" w:w="4968"/>
+            <w:tcW w:type="dxa" w:w="4997"/>
           </w:tcPr>
           <w:p>
             <w:r>
@@ -2869,7 +3334,7 @@
         </w:tc>
         <w:tc>
           <w:tcPr>
-            <w:tcW w:type="dxa" w:w="4968"/>
+            <w:tcW w:type="dxa" w:w="4997"/>
           </w:tcPr>
           <w:p>
             <w:r>
@@ -2881,7 +3346,7 @@
       <w:tr>
         <w:tc>
           <w:tcPr>
-            <w:tcW w:type="dxa" w:w="4968"/>
+            <w:tcW w:type="dxa" w:w="4997"/>
           </w:tcPr>
           <w:p>
             <w:r>
@@ -2891,11 +3356,11 @@
         </w:tc>
         <w:tc>
           <w:tcPr>
-            <w:tcW w:type="dxa" w:w="4968"/>
+            <w:tcW w:type="dxa" w:w="4997"/>
           </w:tcPr>
           <w:p>
             <w:r>
-              <w:t>Identity, approved data model and environments</w:t>
+              <w:t>Identity, approved data model, environments and Key Vault</w:t>
             </w:r>
           </w:p>
         </w:tc>
@@ -2903,7 +3368,7 @@
       <w:tr>
         <w:tc>
           <w:tcPr>
-            <w:tcW w:type="dxa" w:w="4968"/>
+            <w:tcW w:type="dxa" w:w="4997"/>
           </w:tcPr>
           <w:p>
             <w:r>
@@ -2913,11 +3378,11 @@
         </w:tc>
         <w:tc>
           <w:tcPr>
-            <w:tcW w:type="dxa" w:w="4968"/>
+            <w:tcW w:type="dxa" w:w="4997"/>
           </w:tcPr>
           <w:p>
             <w:r>
-              <w:t>Workday events, Power Automate and M365</w:t>
+              <w:t>Workday events, Power Automate and Microsoft 365 notifications</w:t>
             </w:r>
           </w:p>
         </w:tc>
@@ -2925,7 +3390,7 @@
       <w:tr>
         <w:tc>
           <w:tcPr>
-            <w:tcW w:type="dxa" w:w="4968"/>
+            <w:tcW w:type="dxa" w:w="4997"/>
           </w:tcPr>
           <w:p>
             <w:r>
@@ -2935,11 +3400,11 @@
         </w:tc>
         <w:tc>
           <w:tcPr>
-            <w:tcW w:type="dxa" w:w="4968"/>
+            <w:tcW w:type="dxa" w:w="4997"/>
           </w:tcPr>
           <w:p>
             <w:r>
-              <w:t>Power BI, controls, support and rollout</w:t>
+              <w:t>Power BI, observability, support model and regional rollout</w:t>
             </w:r>
           </w:p>
         </w:tc>
@@ -2951,7 +3416,7 @@
         <w:pStyle w:val="Heading1"/>
       </w:pPr>
       <w:r>
-        <w:t>27. Success metrics</w:t>
+        <w:t>26. Five-to-ten minute demo guide</w:t>
       </w:r>
     </w:p>
     <w:p>
@@ -2959,7 +3424,7 @@
         <w:spacing w:after="120"/>
       </w:pPr>
       <w:r>
-        <w:t>Measure case creation time, task completion before start date, overdue-task rate, onboarding readiness, offboarding closure by last working day, delivery outcomes, rework, and stakeholder satisfaction.</w:t>
+        <w:t>Open https://oneflow.highrulez.com. Sign in as Admin. Show the five-worker Workday dataset. Open Nabila’s Preboarding journey; demonstrate task ownership, forms, mock notifications, progress and activity history. Switch to HR or IT roles to show assigned work. Open Hamdan’s Offboarding journey and show clearance/access tasks. Open reports and automation simulation, clearly identifying Phase 1 versus future production integration.</w:t>
       </w:r>
     </w:p>
     <w:p>
@@ -2967,95 +3432,103 @@
         <w:pStyle w:val="Heading1"/>
       </w:pPr>
       <w:r>
-        <w:t>28. Five-to-ten minute demo guide</w:t>
+        <w:t>27. Troubleshooting</w:t>
       </w:r>
     </w:p>
     <w:p>
       <w:pPr>
-        <w:spacing w:after="120"/>
+        <w:pStyle w:val="Heading2"/>
       </w:pPr>
       <w:r>
-        <w:t>1) Sign in as Admin. 2) Show the five-worker Workday dataset. 3) Open Nabila’s Preboarding journey. 4) Switch to HR or IT roles for assigned work. 5) Open Hamdan’s Offboarding journey. 6) Open reports and explain implemented versus proposed components.</w:t>
+        <w:t>User troubleshooting</w:t>
       </w:r>
     </w:p>
     <w:p>
       <w:pPr>
-        <w:pStyle w:val="Heading1"/>
+        <w:pStyle w:val="ListBullet"/>
       </w:pPr>
       <w:r>
-        <w:t>29. Troubleshooting</w:t>
+        <w:t>Portal does not load: confirm internet connection, verify https://oneflow.highrulez.com, refresh the browser, then contact the demo administrator.</w:t>
       </w:r>
     </w:p>
     <w:p>
       <w:pPr>
-        <w:spacing w:after="120"/>
+        <w:pStyle w:val="ListBullet"/>
       </w:pPr>
       <w:r>
-        <w:t>If data looks stale, use available reset/seed controls or clear site storage for the demo browser. If a container cannot be reached, confirm the reverse proxy targets localhost:3005 and Docker maps 3005:3000. Never change the container application port from 3000.</w:t>
+        <w:t>Demo data appears old: use available reset/demo data controls; clear browser site data only when appropriate.</w:t>
       </w:r>
     </w:p>
     <w:p>
       <w:pPr>
-        <w:pStyle w:val="Heading1"/>
+        <w:pStyle w:val="ListBullet"/>
       </w:pPr>
       <w:r>
-        <w:t>30. Deployment manual</w:t>
+        <w:t>Role cannot see a task: verify the correct Quick Login role and case/task assignment.</w:t>
       </w:r>
     </w:p>
     <w:p>
       <w:pPr>
-        <w:spacing w:after="120"/>
+        <w:pStyle w:val="Heading2"/>
       </w:pPr>
       <w:r>
-        <w:t>Set NEXT_PUBLIC_APP_URL=https://oneflow.highrulez.com in the deployment environment. Start with Docker Compose. Synology Reverse Proxy accepts HTTPS on :443 and forwards to http://localhost:3005. Keep the internal Next.js port at 3000. Never commit .env secrets.</w:t>
+        <w:t>Administrator troubleshooting</w:t>
       </w:r>
     </w:p>
     <w:p>
       <w:pPr>
-        <w:pStyle w:val="Heading1"/>
+        <w:spacing w:after="120"/>
       </w:pPr>
       <w:r>
-        <w:t>31. Maintenance</w:t>
+        <w:t>Administrators may verify reverse-proxy and container health. Docker host port 3005 and container port 3000 are internal implementation details; they are not user access URLs.</w:t>
       </w:r>
     </w:p>
     <w:p>
       <w:pPr>
-        <w:spacing w:after="120"/>
+        <w:pStyle w:val="Heading1"/>
       </w:pPr>
       <w:r>
-        <w:t>Review dependencies and images, rotate credentials outside source control, test restore and rollback, monitor logs and health, review access, revalidate pricing, and refresh demo data before events.</w:t>
+        <w:t>28. Deployment and maintenance</w:t>
       </w:r>
     </w:p>
     <w:p>
       <w:pPr>
-        <w:pStyle w:val="Heading1"/>
+        <w:spacing w:after="120"/>
       </w:pPr>
       <w:r>
-        <w:t>32. FAQ</w:t>
+        <w:t>Configure NEXT_PUBLIC_APP_URL=https://oneflow.highrulez.com. Synology Reverse Proxy accepts public HTTPS and forwards internally to the Docker host mapping 3005:3000. Next.js remains on internal port 3000. Keep credentials outside source control. Review dependencies/images, rotate secrets, test restore/rollback, monitor health/logs, review access, revalidate licensing, and refresh demo data before events.</w:t>
       </w:r>
     </w:p>
     <w:p>
       <w:pPr>
-        <w:spacing w:after="120"/>
+        <w:pStyle w:val="Heading1"/>
       </w:pPr>
       <w:r>
-        <w:t>Is this connected to Workday? No, it is a mock. Is Power Automate live? No, it is proposed. Where is data stored today? Browser local storage. Is port 3005 the app port? No: it is only the Docker host mapping; Next.js stays on 3000 in the container.</w:t>
+        <w:t>29. FAQ</w:t>
       </w:r>
     </w:p>
     <w:p>
       <w:pPr>
-        <w:pStyle w:val="Heading1"/>
+        <w:spacing w:after="120"/>
       </w:pPr>
       <w:r>
-        <w:t>33. Conclusion</w:t>
+        <w:t>What is the demo URL? https://oneflow.highrulez.com. Is this connected to Workday? No; the source portal is a mock. Is Power Automate live? No; automation is simulated. Does OneFlow replace Workday? No; Workday remains the HR source system. How will production communication work? Through Microsoft 365/Outlook/Exchange Online with Graph and/or Power Automate as appropriate.</w:t>
       </w:r>
     </w:p>
     <w:p>
       <w:pPr>
+        <w:pStyle w:val="Heading1"/>
+      </w:pPr>
+      <w:r>
+        <w:t>30. Conclusion</w:t>
+      </w:r>
+    </w:p>
+    <w:p>
+      <w:pPr>
         <w:spacing w:after="120"/>
       </w:pPr>
       <w:r>
-        <w:t>OneFlow demonstrates coherent employee lifecycle orchestration: mock source events, role ownership, tasks, forms, notifications, and visibility. The roadmap identifies the controls and integrations needed to progress from prototype to production.</w:t>
+        <w:t>OneFlow addresses the employee-lifecycle coordination challenge by demonstrating onboarding and offboarding workflows with role ownership and central visibility. It is not intended to replace Workday; Workday remains the source HR system and OneFlow is the orchestration/experience layer. A production implementation should align with PPG’s Microsoft/Azure ecosystem, use Microsoft 365 for enterprise communication, and evaluate Power Platform/Azure services against existing PPG enterprise agreements before procurement.</w:t>
       </w:r>
     </w:p>
     <w:p>
@@ -3068,124 +3541,206 @@
         <w:pStyle w:val="Heading1"/>
       </w:pPr>
       <w:r>
-        <w:t>Appendix A. Demo accounts</w:t>
+        <w:t>Appendix A. Environment variables</w:t>
+      </w:r>
+    </w:p>
+    <w:tbl>
+      <w:tblPr>
+        <w:tblStyle w:val="TableGrid"/>
+        <w:tblW w:type="auto" w:w="0"/>
+        <w:jc w:val="center"/>
+        <w:tblLook w:firstColumn="1" w:firstRow="1" w:lastColumn="0" w:lastRow="0" w:noHBand="0" w:noVBand="1" w:val="04A0"/>
+      </w:tblPr>
+      <w:tblGrid>
+        <w:gridCol w:w="4997"/>
+        <w:gridCol w:w="4997"/>
+      </w:tblGrid>
+      <w:tr>
+        <w:tc>
+          <w:tcPr>
+            <w:tcW w:type="dxa" w:w="4997"/>
+            <w:shd w:fill="0B3A70"/>
+          </w:tcPr>
+          <w:p>
+            <w:r>
+              <w:rPr>
+                <w:b/>
+                <w:color w:val="FFFFFF"/>
+              </w:rPr>
+              <w:t>Variable</w:t>
+            </w:r>
+          </w:p>
+        </w:tc>
+        <w:tc>
+          <w:tcPr>
+            <w:tcW w:type="dxa" w:w="4997"/>
+            <w:shd w:fill="0B3A70"/>
+          </w:tcPr>
+          <w:p>
+            <w:r>
+              <w:rPr>
+                <w:b/>
+                <w:color w:val="FFFFFF"/>
+              </w:rPr>
+              <w:t>Purpose</w:t>
+            </w:r>
+          </w:p>
+        </w:tc>
+        <w:trPr>
+          <w:tblHeader/>
+        </w:trPr>
+      </w:tr>
+      <w:tr>
+        <w:tc>
+          <w:tcPr>
+            <w:tcW w:type="dxa" w:w="4997"/>
+          </w:tcPr>
+          <w:p>
+            <w:r>
+              <w:t>NEXT_PUBLIC_APP_URL</w:t>
+            </w:r>
+          </w:p>
+        </w:tc>
+        <w:tc>
+          <w:tcPr>
+            <w:tcW w:type="dxa" w:w="4997"/>
+          </w:tcPr>
+          <w:p>
+            <w:r>
+              <w:t>https://oneflow.highrulez.com</w:t>
+            </w:r>
+          </w:p>
+        </w:tc>
+      </w:tr>
+      <w:tr>
+        <w:tc>
+          <w:tcPr>
+            <w:tcW w:type="dxa" w:w="4997"/>
+          </w:tcPr>
+          <w:p>
+            <w:r>
+              <w:t>PORT</w:t>
+            </w:r>
+          </w:p>
+        </w:tc>
+        <w:tc>
+          <w:tcPr>
+            <w:tcW w:type="dxa" w:w="4997"/>
+          </w:tcPr>
+          <w:p>
+            <w:r>
+              <w:t>Internal application port 3000</w:t>
+            </w:r>
+          </w:p>
+        </w:tc>
+      </w:tr>
+      <w:tr>
+        <w:tc>
+          <w:tcPr>
+            <w:tcW w:type="dxa" w:w="4997"/>
+          </w:tcPr>
+          <w:p>
+            <w:r>
+              <w:t>HOSTNAME</w:t>
+            </w:r>
+          </w:p>
+        </w:tc>
+        <w:tc>
+          <w:tcPr>
+            <w:tcW w:type="dxa" w:w="4997"/>
+          </w:tcPr>
+          <w:p>
+            <w:r>
+              <w:t>Container bind address 0.0.0.0</w:t>
+            </w:r>
+          </w:p>
+        </w:tc>
+      </w:tr>
+      <w:tr>
+        <w:tc>
+          <w:tcPr>
+            <w:tcW w:type="dxa" w:w="4997"/>
+          </w:tcPr>
+          <w:p>
+            <w:r>
+              <w:t>AWS/SES variables</w:t>
+            </w:r>
+          </w:p>
+        </w:tc>
+        <w:tc>
+          <w:tcPr>
+            <w:tcW w:type="dxa" w:w="4997"/>
+          </w:tcPr>
+          <w:p>
+            <w:r>
+              <w:t>Prototype/legacy optional configuration — NOT recommended for production mail</w:t>
+            </w:r>
+          </w:p>
+        </w:tc>
+      </w:tr>
+    </w:tbl>
+    <w:p/>
+    <w:p>
+      <w:pPr>
+        <w:pStyle w:val="Heading1"/>
+      </w:pPr>
+      <w:r>
+        <w:t>Appendix B. Pricing sources</w:t>
       </w:r>
     </w:p>
     <w:p>
       <w:pPr>
-        <w:spacing w:after="120"/>
+        <w:pStyle w:val="ListBullet"/>
       </w:pPr>
       <w:r>
-        <w:t>Use role-specific demo accounts configured in the prototype. The shared password is intentionally not printed; use the local demo login or secure handover material.</w:t>
+        <w:t>Microsoft Power Apps pricing (Malaysia): https://www.microsoft.com/en-my/power-platform/products/power-apps/pricing</w:t>
       </w:r>
     </w:p>
     <w:p>
       <w:pPr>
-        <w:pStyle w:val="Heading1"/>
+        <w:pStyle w:val="ListBullet"/>
       </w:pPr>
       <w:r>
-        <w:t>Appendix B. Workforce and location</w:t>
+        <w:t>Microsoft Power Automate pricing (Malaysia): https://www.microsoft.com/en-my/power-platform/products/power-automate/pricing</w:t>
       </w:r>
     </w:p>
     <w:p>
       <w:pPr>
-        <w:spacing w:after="120"/>
+        <w:pStyle w:val="ListBullet"/>
       </w:pPr>
       <w:r>
-        <w:t>Exactly five workers: three Active, one Preboarding, and one Offboarding. All use Malaysia – UOA Business Park.</w:t>
+        <w:t>Microsoft Power BI pricing (Malaysia): https://www.microsoft.com/en-my/power-platform/products/power-bi</w:t>
       </w:r>
     </w:p>
     <w:p>
       <w:pPr>
-        <w:pStyle w:val="Heading1"/>
+        <w:pStyle w:val="ListBullet"/>
       </w:pPr>
       <w:r>
-        <w:t>Appendix C. Role matrix</w:t>
+        <w:t>Azure pricing calculator: https://azure.microsoft.com/pricing/calculator/</w:t>
       </w:r>
     </w:p>
     <w:p>
       <w:pPr>
-        <w:spacing w:after="120"/>
+        <w:pStyle w:val="Heading1"/>
       </w:pPr>
       <w:r>
-        <w:t>See Section 14.</w:t>
+        <w:t>Appendix C. Technical deployment note</w:t>
       </w:r>
     </w:p>
     <w:p>
       <w:pPr>
-        <w:pStyle w:val="Heading1"/>
+        <w:spacing w:after="120"/>
       </w:pPr>
       <w:r>
-        <w:t>Appendix D. Technology stack</w:t>
-      </w:r>
-    </w:p>
-    <w:p>
-      <w:pPr>
-        <w:spacing w:after="120"/>
-      </w:pPr>
-      <w:r>
-        <w:t>Next.js 15, React 19, TypeScript, Tailwind CSS, Node.js 22 Alpine, Docker Compose, and a local-storage repository abstraction.</w:t>
-      </w:r>
-    </w:p>
-    <w:p>
-      <w:pPr>
-        <w:pStyle w:val="Heading1"/>
-      </w:pPr>
-      <w:r>
-        <w:t>Appendix E. Environment variables</w:t>
-      </w:r>
-    </w:p>
-    <w:p>
-      <w:pPr>
-        <w:spacing w:after="120"/>
-      </w:pPr>
-      <w:r>
-        <w:t>NEXT_PUBLIC_APP_URL is https://oneflow.highrulez.com. PORT=3000 and HOSTNAME=0.0.0.0 apply inside the container. AWS and SES variables are optional configuration; keep all secrets outside source control.</w:t>
-      </w:r>
-    </w:p>
-    <w:p>
-      <w:pPr>
-        <w:pStyle w:val="Heading1"/>
-      </w:pPr>
-      <w:r>
-        <w:t>Appendix F. Cost assumptions</w:t>
-      </w:r>
-    </w:p>
-    <w:p>
-      <w:pPr>
-        <w:spacing w:after="120"/>
-      </w:pPr>
-      <w:r>
-        <w:t>Public price pages checked 19 August 2026; USD 1 = RM4.25 planning conversion; prices exclude taxes and enterprise discounts.</w:t>
-      </w:r>
-    </w:p>
-    <w:p>
-      <w:pPr>
-        <w:pStyle w:val="Heading1"/>
-      </w:pPr>
-      <w:r>
-        <w:t>Appendix G. Pricing sources</w:t>
-      </w:r>
-    </w:p>
-    <w:p>
-      <w:pPr>
-        <w:spacing w:after="120"/>
-      </w:pPr>
-      <w:r>
-        <w:t>Microsoft Power Apps (Malaysia): https://www.microsoft.com/en-my/power-platform/products/power-apps/pricing</w:t>
-        <w:br/>
-        <w:t>Microsoft Power Automate (Malaysia): https://www.microsoft.com/en-my/power-platform/products/power-automate/pricing</w:t>
-        <w:br/>
-        <w:t>Microsoft Power BI (Malaysia): https://www.microsoft.com/en-my/power-platform/products/power-bi</w:t>
-        <w:br/>
-        <w:t>AWS SES: https://aws.amazon.com/ses/pricing/</w:t>
+        <w:t>The public endpoint is https://oneflow.highrulez.com. Internal technical mapping is Docker host port 3005 to application container port 3000; it must not be presented as a normal user URL.</w:t>
       </w:r>
     </w:p>
     <w:sectPr>
       <w:headerReference w:type="default" r:id="rId12"/>
       <w:footerReference w:type="default" r:id="rId13"/>
       <w:pgSz w:w="12240" w:h="15840"/>
-      <w:pgMar w:top="1152" w:right="1152" w:bottom="1008" w:left="1152" w:header="720" w:footer="720" w:gutter="0"/>
+      <w:pgMar w:top="1123" w:right="1123" w:bottom="1008" w:left="1123" w:header="720" w:footer="720" w:gutter="0"/>
       <w:cols w:space="720"/>
       <w:docGrid w:linePitch="360"/>
     </w:sectPr>
@@ -3588,10 +4143,14 @@
     <w:name w:val="Normal"/>
     <w:qFormat/>
     <w:rsid w:val="00FC693F"/>
+    <w:pPr>
+      <w:spacing w:after="120"/>
+    </w:pPr>
     <w:rPr>
       <w:rFonts w:ascii="Calibri" w:hAnsi="Calibri"/>
+      <w:b w:val="0"/>
       <w:color w:val="000000"/>
-      <w:sz w:val="21"/>
+      <w:sz w:val="20"/>
     </w:rPr>
   </w:style>
   <w:style w:type="paragraph" w:styleId="Header">
@@ -3649,7 +4208,7 @@
     <w:pPr>
       <w:keepNext/>
       <w:keepLines/>
-      <w:spacing w:before="480" w:after="0"/>
+      <w:spacing w:before="480" w:after="120"/>
       <w:outlineLvl w:val="0"/>
     </w:pPr>
     <w:rPr>
@@ -3673,7 +4232,7 @@
     <w:pPr>
       <w:keepNext/>
       <w:keepLines/>
-      <w:spacing w:before="200" w:after="0"/>
+      <w:spacing w:before="200" w:after="120"/>
       <w:outlineLvl w:val="1"/>
     </w:pPr>
     <w:rPr>
@@ -3697,7 +4256,7 @@
     <w:pPr>
       <w:keepNext/>
       <w:keepLines/>
-      <w:spacing w:before="200" w:after="0"/>
+      <w:spacing w:before="200" w:after="120"/>
       <w:outlineLvl w:val="2"/>
     </w:pPr>
     <w:rPr>
@@ -3939,7 +4498,7 @@
       <w:pBdr>
         <w:bottom w:val="single" w:sz="8" w:space="4" w:color="4F81BD" w:themeColor="accent1"/>
       </w:pBdr>
-      <w:spacing w:after="300" w:line="240" w:lineRule="auto"/>
+      <w:spacing w:after="120" w:line="240" w:lineRule="auto"/>
       <w:contextualSpacing/>
     </w:pPr>
     <w:rPr>

</xml_diff>